<commit_message>
Add rank target days, news tip-offs, investment odds and better feedback
- Ranks have target days and score bonuses (CONFIG.ranks byDay/bonus)
- Morning tip-off for that night's news headline (CONFIG.events.forecast)
- Bank shows a comparison table of expected return, usual range and losing days
- First-week checklist, earlier bankruptcy warning with a way out, day recap wins
- CLAUDE.md: never use the C: drive; throwaway files go in D:\AI\dg_scratch
- Config Guide and CHANGELOG (section 39) updated

Co-Authored-By: Claude Opus 5.5 <noreply@anthropic.com>
</commit_message>
<xml_diff>
--- a/docs/Daily Grind Config Guide.docx
+++ b/docs/Daily Grind Config Guide.docx
@@ -13,7 +13,7 @@
     <w:p>
       <w:pPr/>
       <w:r>
-        <w:t xml:space="preserve">Oct 19, 2026</w:t>
+        <w:t xml:space="preserve">Oct 20, 2026</w:t>
       </w:r>
       <w:r>
         <w:t xml:space="preserve"> · </w:t>
@@ -726,6 +726,41 @@
           <w:p>
             <w:pPr/>
             <w:r>
+              <w:t xml:space="preserve">events</w:t>
+            </w:r>
+          </w:p>
+        </w:tc>
+        <w:tc>
+          <w:tcPr>
+            <w:tcW w:w="4920" w:type="dxa"/>
+          </w:tcPr>
+          <w:p>
+            <w:pPr/>
+            <w:r>
+              <w:t xml:space="preserve">Which event happens each night, and how often a news headline is tipped off that morning</w:t>
+            </w:r>
+          </w:p>
+        </w:tc>
+        <w:tc>
+          <w:tcPr>
+            <w:tcW w:w="3215" w:type="dxa"/>
+          </w:tcPr>
+          <w:p>
+            <w:pPr/>
+            <w:r>
+              <w:t xml:space="preserve">forecast:0.7</w:t>
+            </w:r>
+          </w:p>
+        </w:tc>
+      </w:tr>
+      <w:tr>
+        <w:tc>
+          <w:tcPr>
+            <w:tcW w:w="1225" w:type="dxa"/>
+          </w:tcPr>
+          <w:p>
+            <w:pPr/>
+            <w:r>
               <w:t xml:space="preserve">loan</w:t>
             </w:r>
           </w:p>
@@ -772,7 +807,7 @@
           <w:p>
             <w:pPr/>
             <w:r>
-              <w:t xml:space="preserve">When the game ends for being broke</w:t>
+              <w:t xml:space="preserve">When the game ends for being broke, and how early the warning starts</w:t>
             </w:r>
           </w:p>
         </w:tc>
@@ -842,7 +877,7 @@
           <w:p>
             <w:pPr/>
             <w:r>
-              <w:t xml:space="preserve">Net-worth goals: Comfortable $2,000, Wealthy $5,000, Tycoon $10,000</w:t>
+              <w:t xml:space="preserve">Net-worth goals and target days: Comfortable $2,000 by day 8, Wealthy $5,000 by day 12, Tycoon $10,000 by day 15. Reaching one by its day adds a score bonus.</w:t>
             </w:r>
           </w:p>
         </w:tc>
@@ -1581,6 +1616,190 @@
             <w:pPr/>
             <w:r>
               <w:t xml:space="preserve">false removes loans from the game.</w:t>
+            </w:r>
+          </w:p>
+        </w:tc>
+      </w:tr>
+      <w:tr>
+        <w:tc>
+          <w:tcPr>
+            <w:tcW w:w="2175" w:type="dxa"/>
+          </w:tcPr>
+          <w:p>
+            <w:pPr/>
+            <w:r>
+              <w:t xml:space="preserve">Change when ranks are due</w:t>
+            </w:r>
+          </w:p>
+        </w:tc>
+        <w:tc>
+          <w:tcPr>
+            <w:tcW w:w="1864" w:type="dxa"/>
+          </w:tcPr>
+          <w:p>
+            <w:pPr/>
+            <w:r>
+              <w:t xml:space="preserve">ranks: byDay</w:t>
+            </w:r>
+          </w:p>
+        </w:tc>
+        <w:tc>
+          <w:tcPr>
+            <w:tcW w:w="1621" w:type="dxa"/>
+          </w:tcPr>
+          <w:p>
+            <w:pPr/>
+            <w:r>
+              <w:t xml:space="preserve">8, 12, 15</w:t>
+            </w:r>
+          </w:p>
+        </w:tc>
+        <w:tc>
+          <w:tcPr>
+            <w:tcW w:w="3700" w:type="dxa"/>
+          </w:tcPr>
+          <w:p>
+            <w:pPr/>
+            <w:r>
+              <w:t xml:space="preserve">The day each rank must be reached by to earn its bonus. 0 removes the target.</w:t>
+            </w:r>
+          </w:p>
+        </w:tc>
+      </w:tr>
+      <w:tr>
+        <w:tc>
+          <w:tcPr>
+            <w:tcW w:w="2175" w:type="dxa"/>
+          </w:tcPr>
+          <w:p>
+            <w:pPr/>
+            <w:r>
+              <w:t xml:space="preserve">Make on-time ranks worth more</w:t>
+            </w:r>
+          </w:p>
+        </w:tc>
+        <w:tc>
+          <w:tcPr>
+            <w:tcW w:w="1864" w:type="dxa"/>
+          </w:tcPr>
+          <w:p>
+            <w:pPr/>
+            <w:r>
+              <w:t xml:space="preserve">ranks: bonus</w:t>
+            </w:r>
+          </w:p>
+        </w:tc>
+        <w:tc>
+          <w:tcPr>
+            <w:tcW w:w="1621" w:type="dxa"/>
+          </w:tcPr>
+          <w:p>
+            <w:pPr/>
+            <w:r>
+              <w:t xml:space="preserve">500, 1000, 2000</w:t>
+            </w:r>
+          </w:p>
+        </w:tc>
+        <w:tc>
+          <w:tcPr>
+            <w:tcW w:w="3700" w:type="dxa"/>
+          </w:tcPr>
+          <w:p>
+            <w:pPr/>
+            <w:r>
+              <w:t xml:space="preserve">Score points added for reaching a rank by its target day.</w:t>
+            </w:r>
+          </w:p>
+        </w:tc>
+      </w:tr>
+      <w:tr>
+        <w:tc>
+          <w:tcPr>
+            <w:tcW w:w="2175" w:type="dxa"/>
+          </w:tcPr>
+          <w:p>
+            <w:pPr/>
+            <w:r>
+              <w:t xml:space="preserve">Tip off news more or less often</w:t>
+            </w:r>
+          </w:p>
+        </w:tc>
+        <w:tc>
+          <w:tcPr>
+            <w:tcW w:w="1864" w:type="dxa"/>
+          </w:tcPr>
+          <w:p>
+            <w:pPr/>
+            <w:r>
+              <w:t xml:space="preserve">events: forecast</w:t>
+            </w:r>
+          </w:p>
+        </w:tc>
+        <w:tc>
+          <w:tcPr>
+            <w:tcW w:w="1621" w:type="dxa"/>
+          </w:tcPr>
+          <w:p>
+            <w:pPr/>
+            <w:r>
+              <w:t xml:space="preserve">0.7</w:t>
+            </w:r>
+          </w:p>
+        </w:tc>
+        <w:tc>
+          <w:tcPr>
+            <w:tcW w:w="3700" w:type="dxa"/>
+          </w:tcPr>
+          <w:p>
+            <w:pPr/>
+            <w:r>
+              <w:t xml:space="preserve">1 tips off every news night, 0 never does.</w:t>
+            </w:r>
+          </w:p>
+        </w:tc>
+      </w:tr>
+      <w:tr>
+        <w:tc>
+          <w:tcPr>
+            <w:tcW w:w="2175" w:type="dxa"/>
+          </w:tcPr>
+          <w:p>
+            <w:pPr/>
+            <w:r>
+              <w:t xml:space="preserve">Warn about bankruptcy sooner</w:t>
+            </w:r>
+          </w:p>
+        </w:tc>
+        <w:tc>
+          <w:tcPr>
+            <w:tcW w:w="1864" w:type="dxa"/>
+          </w:tcPr>
+          <w:p>
+            <w:pPr/>
+            <w:r>
+              <w:t xml:space="preserve">bankrupt: warnDaysBefore</w:t>
+            </w:r>
+          </w:p>
+        </w:tc>
+        <w:tc>
+          <w:tcPr>
+            <w:tcW w:w="1621" w:type="dxa"/>
+          </w:tcPr>
+          <w:p>
+            <w:pPr/>
+            <w:r>
+              <w:t xml:space="preserve">2</w:t>
+            </w:r>
+          </w:p>
+        </w:tc>
+        <w:tc>
+          <w:tcPr>
+            <w:tcW w:w="3700" w:type="dxa"/>
+          </w:tcPr>
+          <w:p>
+            <w:pPr/>
+            <w:r>
+              <w:t xml:space="preserve">How many days before the bankruptcy count starts the warning appears.</w:t>
             </w:r>
           </w:p>
         </w:tc>

</xml_diff>

<commit_message>
Housing bubble, 1.5x sleep, shorter shifts, combined burnout, illness rework
- Housing bubble: 50% chance to lose your home; apply again to move back in
- Sleep at home gives 1.5x energy, happiness and health (caps included)
- Every shift band is one hour shorter for the same pay
- Burnout: more than 10h of work + study a day, 3 days running
- Illness: low energy counts after 3 low nights in 5; fixed illness mix;
  10 health a night; flu 3 days / 2h / 5 happiness; cold and flu 80% cured
  by a night at home, else Hospital; dengue and pneumonia need the Hospital;
  pandemics 1.3x
- Rules text, CONFIG Guide, sim bot, CHANGELOG 44 and QA sim report

Co-Authored-By: Claude Opus 5.5 <noreply@anthropic.com>
Claude-Session: https://claude.ai/code/session_01X4PpPPtrsCd6ZJRCWRgVNF
</commit_message>
<xml_diff>
--- a/docs/Daily Grind Config Guide.docx
+++ b/docs/Daily Grind Config Guide.docx
@@ -13,7 +13,7 @@
     <w:p>
       <w:pPr/>
       <w:r>
-        <w:t xml:space="preserve">Oct 20, 2026</w:t>
+        <w:t>Oct 21, 2026</w:t>
       </w:r>
       <w:r>
         <w:t xml:space="preserve"> · </w:t>
@@ -352,7 +352,7 @@
           <w:p>
             <w:pPr/>
             <w:r>
-              <w:t xml:space="preserve">Length of the day, walking, rent every 5 days, game length of 15 days, how long actions take</w:t>
+              <w:t>Length of the day, walking, rent every 5 days, game length of 15 days, shift length by pay, how long actions take</w:t>
             </w:r>
           </w:p>
         </w:tc>
@@ -457,7 +457,7 @@
           <w:p>
             <w:pPr/>
             <w:r>
-              <w:t xml:space="preserve">The chance of falling ill each night, and what changes it</w:t>
+              <w:t>The chance of falling ill each night, what changes it (low energy only counts after 3 low nights in 5, pandemics add 30%), and which illness you catch</w:t>
             </w:r>
           </w:p>
         </w:tc>
@@ -468,7 +468,7 @@
           <w:p>
             <w:pPr/>
             <w:r>
-              <w:t xml:space="preserve">cutForEveryone:0.75</w:t>
+              <w:t>lowNights:3</w:t>
             </w:r>
           </w:p>
         </w:tc>
@@ -492,7 +492,7 @@
           <w:p>
             <w:pPr/>
             <w:r>
-              <w:t xml:space="preserve">Illness costs, ward stays and life insurance</w:t>
+              <w:t>Illness costs, which illnesses can be slept off at home, ward stays and life insurance</w:t>
             </w:r>
           </w:p>
         </w:tc>
@@ -503,7 +503,7 @@
           <w:p>
             <w:pPr/>
             <w:r>
-              <w:t xml:space="preserve">insuranceCost:620</w:t>
+              <w:t>homeRecover:0.8</w:t>
             </w:r>
           </w:p>
         </w:tc>
@@ -562,7 +562,7 @@
           <w:p>
             <w:pPr/>
             <w:r>
-              <w:t xml:space="preserve">Too many hours of study or work in a row causes burnout</w:t>
+              <w:t>More than 10 hours of work and study a day, 3 days in a row, causes burnout</w:t>
             </w:r>
           </w:p>
         </w:tc>
@@ -573,7 +573,7 @@
           <w:p>
             <w:pPr/>
             <w:r>
-              <w:t xml:space="preserve">studyMinutes:300</w:t>
+              <w:t>loadMinutes:600</w:t>
             </w:r>
           </w:p>
         </w:tc>
@@ -667,7 +667,7 @@
           <w:p>
             <w:pPr/>
             <w:r>
-              <w:t xml:space="preserve">Energy and happiness from resting and sleeping</w:t>
+              <w:t>Energy and happiness from resting and sleeping (a night’s sleep gives 1.5 times the energy of resting)</w:t>
             </w:r>
           </w:p>
         </w:tc>
@@ -679,6 +679,41 @@
             <w:pPr/>
             <w:r>
               <w:t xml:space="preserve">napMinutes:120</w:t>
+            </w:r>
+          </w:p>
+        </w:tc>
+      </w:tr>
+      <w:tr>
+        <w:tc>
+          <w:tcPr>
+            <w:tcW w:w="1225" w:type="dxa"/>
+          </w:tcPr>
+          <w:p>
+            <w:pPr/>
+            <w:r>
+              <w:t>housing</w:t>
+            </w:r>
+          </w:p>
+        </w:tc>
+        <w:tc>
+          <w:tcPr>
+            <w:tcW w:w="4920" w:type="dxa"/>
+          </w:tcPr>
+          <w:p>
+            <w:pPr/>
+            <w:r>
+              <w:t>Losing your home when a housing bubble bursts, and what applying again costs</w:t>
+            </w:r>
+          </w:p>
+        </w:tc>
+        <w:tc>
+          <w:tcPr>
+            <w:tcW w:w="3215" w:type="dxa"/>
+          </w:tcPr>
+          <w:p>
+            <w:pPr/>
+            <w:r>
+              <w:t>loseChance:0.5</w:t>
             </w:r>
           </w:p>
         </w:tc>
@@ -2007,7 +2042,7 @@
           <w:p>
             <w:pPr/>
             <w:r>
-              <w:t xml:space="preserve">burnout: studyMinutes</w:t>
+              <w:t>burnout: loadMinutes</w:t>
             </w:r>
           </w:p>
         </w:tc>
@@ -2018,7 +2053,7 @@
           <w:p>
             <w:pPr/>
             <w:r>
-              <w:t xml:space="preserve">300</w:t>
+              <w:t>600</w:t>
             </w:r>
           </w:p>
         </w:tc>
@@ -2029,7 +2064,237 @@
           <w:p>
             <w:pPr/>
             <w:r>
-              <w:t xml:space="preserve">300 is 5 hours of study a day. Lower means burnout starts sooner.</w:t>
+              <w:t>600 is 10 hours of work and study together a day. Lower means burnout starts sooner.</w:t>
+            </w:r>
+          </w:p>
+        </w:tc>
+      </w:tr>
+      <w:tr>
+        <w:tc>
+          <w:tcPr>
+            <w:tcW w:w="2175" w:type="dxa"/>
+          </w:tcPr>
+          <w:p>
+            <w:pPr/>
+            <w:r>
+              <w:t>Make sleep restore more energy</w:t>
+            </w:r>
+          </w:p>
+        </w:tc>
+        <w:tc>
+          <w:tcPr>
+            <w:tcW w:w="1864" w:type="dxa"/>
+          </w:tcPr>
+          <w:p>
+            <w:pPr/>
+            <w:r>
+              <w:t>sleep: energyX</w:t>
+            </w:r>
+          </w:p>
+        </w:tc>
+        <w:tc>
+          <w:tcPr>
+            <w:tcW w:w="1621" w:type="dxa"/>
+          </w:tcPr>
+          <w:p>
+            <w:pPr/>
+            <w:r>
+              <w:t>1.5</w:t>
+            </w:r>
+          </w:p>
+        </w:tc>
+        <w:tc>
+          <w:tcPr>
+            <w:tcW w:w="3700" w:type="dxa"/>
+          </w:tcPr>
+          <w:p>
+            <w:pPr/>
+            <w:r>
+              <w:t>How many times faster a night’s sleep restores energy than resting. maxEnergy (52) caps one night.</w:t>
+            </w:r>
+          </w:p>
+        </w:tc>
+      </w:tr>
+      <w:tr>
+        <w:tc>
+          <w:tcPr>
+            <w:tcW w:w="2175" w:type="dxa"/>
+          </w:tcPr>
+          <w:p>
+            <w:pPr/>
+            <w:r>
+              <w:t>Change which illness you catch</w:t>
+            </w:r>
+          </w:p>
+        </w:tc>
+        <w:tc>
+          <w:tcPr>
+            <w:tcW w:w="1864" w:type="dxa"/>
+          </w:tcPr>
+          <w:p>
+            <w:pPr/>
+            <w:r>
+              <w:t>illness: mix</w:t>
+            </w:r>
+          </w:p>
+        </w:tc>
+        <w:tc>
+          <w:tcPr>
+            <w:tcW w:w="1621" w:type="dxa"/>
+          </w:tcPr>
+          <w:p>
+            <w:pPr/>
+            <w:r>
+              <w:t>cold 0.30, flu 0.40, dengue 0.15, pneumonia 0.15</w:t>
+            </w:r>
+          </w:p>
+        </w:tc>
+        <w:tc>
+          <w:tcPr>
+            <w:tcW w:w="3700" w:type="dxa"/>
+          </w:tcPr>
+          <w:p>
+            <w:pPr/>
+            <w:r>
+              <w:t>Relative weights. Raise one to make that illness more common.</w:t>
+            </w:r>
+          </w:p>
+        </w:tc>
+      </w:tr>
+      <w:tr>
+        <w:tc>
+          <w:tcPr>
+            <w:tcW w:w="2175" w:type="dxa"/>
+          </w:tcPr>
+          <w:p>
+            <w:pPr/>
+            <w:r>
+              <w:t>Make sleeping off a cold or flu easier</w:t>
+            </w:r>
+          </w:p>
+        </w:tc>
+        <w:tc>
+          <w:tcPr>
+            <w:tcW w:w="1864" w:type="dxa"/>
+          </w:tcPr>
+          <w:p>
+            <w:pPr/>
+            <w:r>
+              <w:t>hospital: homeRecover</w:t>
+            </w:r>
+          </w:p>
+        </w:tc>
+        <w:tc>
+          <w:tcPr>
+            <w:tcW w:w="1621" w:type="dxa"/>
+          </w:tcPr>
+          <w:p>
+            <w:pPr/>
+            <w:r>
+              <w:t>0.8</w:t>
+            </w:r>
+          </w:p>
+        </w:tc>
+        <w:tc>
+          <w:tcPr>
+            <w:tcW w:w="3700" w:type="dxa"/>
+          </w:tcPr>
+          <w:p>
+            <w:pPr/>
+            <w:r>
+              <w:t>The chance a night’s sleep at home cures a cold or the flu. If the roll fails, only the Hospital can cure it.</w:t>
+            </w:r>
+          </w:p>
+        </w:tc>
+      </w:tr>
+      <w:tr>
+        <w:tc>
+          <w:tcPr>
+            <w:tcW w:w="2175" w:type="dxa"/>
+          </w:tcPr>
+          <w:p>
+            <w:pPr/>
+            <w:r>
+              <w:t>Make losing your home less likely</w:t>
+            </w:r>
+          </w:p>
+        </w:tc>
+        <w:tc>
+          <w:tcPr>
+            <w:tcW w:w="1864" w:type="dxa"/>
+          </w:tcPr>
+          <w:p>
+            <w:pPr/>
+            <w:r>
+              <w:t>housing: loseChance</w:t>
+            </w:r>
+          </w:p>
+        </w:tc>
+        <w:tc>
+          <w:tcPr>
+            <w:tcW w:w="1621" w:type="dxa"/>
+          </w:tcPr>
+          <w:p>
+            <w:pPr/>
+            <w:r>
+              <w:t>0.5</w:t>
+            </w:r>
+          </w:p>
+        </w:tc>
+        <w:tc>
+          <w:tcPr>
+            <w:tcW w:w="3700" w:type="dxa"/>
+          </w:tcPr>
+          <w:p>
+            <w:pPr/>
+            <w:r>
+              <w:t>The chance a housing bubble takes your home. 0 switches it off.</w:t>
+            </w:r>
+          </w:p>
+        </w:tc>
+      </w:tr>
+      <w:tr>
+        <w:tc>
+          <w:tcPr>
+            <w:tcW w:w="2175" w:type="dxa"/>
+          </w:tcPr>
+          <w:p>
+            <w:pPr/>
+            <w:r>
+              <w:t>Change shift lengths</w:t>
+            </w:r>
+          </w:p>
+        </w:tc>
+        <w:tc>
+          <w:tcPr>
+            <w:tcW w:w="1864" w:type="dxa"/>
+          </w:tcPr>
+          <w:p>
+            <w:pPr/>
+            <w:r>
+              <w:t>time: shifts, minutes</w:t>
+            </w:r>
+          </w:p>
+        </w:tc>
+        <w:tc>
+          <w:tcPr>
+            <w:tcW w:w="1621" w:type="dxa"/>
+          </w:tcPr>
+          <w:p>
+            <w:pPr/>
+            <w:r>
+              <w:t>270, 225, 195, 150</w:t>
+            </w:r>
+          </w:p>
+        </w:tc>
+        <w:tc>
+          <w:tcPr>
+            <w:tcW w:w="3700" w:type="dxa"/>
+          </w:tcPr>
+          <w:p>
+            <w:pPr/>
+            <w:r>
+              <w:t>Shift length for each pay band, lowest pay first. Keep better-paid jobs on shorter shifts so pay per hour still rises.</w:t>
             </w:r>
           </w:p>
         </w:tc>
@@ -2272,7 +2537,7 @@
           <w:p>
             <w:pPr/>
             <w:r>
-              <w:t xml:space="preserve">Long sessions cost 6% energy, and burnout starts after 4 hours of study.</w:t>
+              <w:t>Long sessions cost 6% energy, and burnout starts after 9 hours of work and study a day.</w:t>
             </w:r>
           </w:p>
         </w:tc>
@@ -2476,13 +2741,13 @@
     <w:p>
       <w:pPr/>
       <w:r>
-        <w:t xml:space="preserve">As of 19 October 2026, MASTER CONFIG starts around line 563 and ends around line 1080 of DailyGrind\index.html. Use Ctrl+F to search for a part name, such as </w:t>
+        <w:t xml:space="preserve">As of 21 October 2026, MASTER CONFIG starts around line 635 and ends around line 1198 of DailyGrind\index.html. Use Ctrl+F to search for a part name, such as </w:t>
       </w:r>
       <w:r>
         <w:rPr>
           <w:rStyle w:val="CodeChar"/>
         </w:rPr>
-        <w:t xml:space="preserve">burnout:</w:t>
+        <w:t>burnout:</w:t>
       </w:r>
       <w:r>
         <w:t xml:space="preserve"> or </w:t>
@@ -2491,10 +2756,10 @@
         <w:rPr>
           <w:rStyle w:val="CodeChar"/>
         </w:rPr>
-        <w:t xml:space="preserve">traits:</w:t>
-      </w:r>
-      <w:r>
-        <w:t xml:space="preserve">, to jump straight to it.</w:t>
+        <w:t>traits:</w:t>
+      </w:r>
+      <w:r>
+        <w:t>, to jump straight to it.</w:t>
       </w:r>
     </w:p>
     <w:p>
@@ -2514,7 +2779,7 @@
     <w:p>
       <w:pPr/>
       <w:r>
-        <w:t xml:space="preserve">The three difficulty levels are set in a small table in the code, just below MASTER CONFIG (around line 1133 of index.html). They are not in MASTER CONFIG, so edit them there.</w:t>
+        <w:t>The three difficulty levels are set in a small table in the code, just below MASTER CONFIG (around line 1264 of index.html). They are not in MASTER CONFIG, so edit them there.</w:t>
       </w:r>
     </w:p>
     <w:tbl>

</xml_diff>

<commit_message>
One storyline a game, no repeats, 100 mini stories and 30 storylines
- Exactly one storyline per game, starting on a random day 2-8, then a
  15-day gap (CONFIG.events.storyline); macro shocks keep their own
  nightly chance (events.macroChance) and never overlap the storyline
- Mini stories, macro shocks and storylines dealt from shuffled decks;
  no chapter repeats within a storyline
- 91 new mini stories (100 total), 23 new storylines (30 total), 8 more
  chapters for each original storyline (471 chapters)
- Housing bubble storyline rolls the home-loss chance; bird flu counts as
  an outbreak for illness
- Topic-based decision headings and icons; 30 twists
- CHANGELOG 45 and CONFIG Guide

Co-Authored-By: Claude Opus 5.5 <noreply@anthropic.com>
Claude-Session: https://claude.ai/code/session_01X4PpPPtrsCd6ZJRCWRgVNF
</commit_message>
<xml_diff>
--- a/docs/Daily Grind Config Guide.docx
+++ b/docs/Daily Grind Config Guide.docx
@@ -13,7 +13,7 @@
     <w:p>
       <w:pPr/>
       <w:r>
-        <w:t>Oct 21, 2026</w:t>
+        <w:t>Oct 22, 2026</w:t>
       </w:r>
       <w:r>
         <w:t xml:space="preserve"> · </w:t>
@@ -772,7 +772,7 @@
           <w:p>
             <w:pPr/>
             <w:r>
-              <w:t xml:space="preserve">Which event happens each night, and how often a news headline is tipped off that morning</w:t>
+              <w:t>Which event happens each night: one storyline a game (start window and gap), the chance of a macro shock, the daily event odds, and how often a news headline is tipped off that morning</w:t>
             </w:r>
           </w:p>
         </w:tc>
@@ -783,7 +783,7 @@
           <w:p>
             <w:pPr/>
             <w:r>
-              <w:t xml:space="preserve">forecast:0.7</w:t>
+              <w:t>storyline: fromDay:2, toDay:8</w:t>
             </w:r>
           </w:p>
         </w:tc>
@@ -1801,6 +1801,144 @@
           <w:p>
             <w:pPr/>
             <w:r>
+              <w:t>Change when the storyline starts</w:t>
+            </w:r>
+          </w:p>
+        </w:tc>
+        <w:tc>
+          <w:tcPr>
+            <w:tcW w:w="1864" w:type="dxa"/>
+          </w:tcPr>
+          <w:p>
+            <w:pPr/>
+            <w:r>
+              <w:t>events: storyline, fromDay and toDay</w:t>
+            </w:r>
+          </w:p>
+        </w:tc>
+        <w:tc>
+          <w:tcPr>
+            <w:tcW w:w="1621" w:type="dxa"/>
+          </w:tcPr>
+          <w:p>
+            <w:pPr/>
+            <w:r>
+              <w:t>2 and 8</w:t>
+            </w:r>
+          </w:p>
+        </w:tc>
+        <w:tc>
+          <w:tcPr>
+            <w:tcW w:w="3700" w:type="dxa"/>
+          </w:tcPr>
+          <w:p>
+            <w:pPr/>
+            <w:r>
+              <w:t>The storyline starts on a random evening between these days. Every game has one.</w:t>
+            </w:r>
+          </w:p>
+        </w:tc>
+      </w:tr>
+      <w:tr>
+        <w:tc>
+          <w:tcPr>
+            <w:tcW w:w="2175" w:type="dxa"/>
+          </w:tcPr>
+          <w:p>
+            <w:pPr/>
+            <w:r>
+              <w:t>Allow more than one storyline</w:t>
+            </w:r>
+          </w:p>
+        </w:tc>
+        <w:tc>
+          <w:tcPr>
+            <w:tcW w:w="1864" w:type="dxa"/>
+          </w:tcPr>
+          <w:p>
+            <w:pPr/>
+            <w:r>
+              <w:t>events: storyline, gapDays</w:t>
+            </w:r>
+          </w:p>
+        </w:tc>
+        <w:tc>
+          <w:tcPr>
+            <w:tcW w:w="1621" w:type="dxa"/>
+          </w:tcPr>
+          <w:p>
+            <w:pPr/>
+            <w:r>
+              <w:t>15</w:t>
+            </w:r>
+          </w:p>
+        </w:tc>
+        <w:tc>
+          <w:tcPr>
+            <w:tcW w:w="3700" w:type="dxa"/>
+          </w:tcPr>
+          <w:p>
+            <w:pPr/>
+            <w:r>
+              <w:t>Days after a storyline ends before another can start. With 15-day games, 15 means one a game.</w:t>
+            </w:r>
+          </w:p>
+        </w:tc>
+      </w:tr>
+      <w:tr>
+        <w:tc>
+          <w:tcPr>
+            <w:tcW w:w="2175" w:type="dxa"/>
+          </w:tcPr>
+          <w:p>
+            <w:pPr/>
+            <w:r>
+              <w:t>Make macro shocks more or less common</w:t>
+            </w:r>
+          </w:p>
+        </w:tc>
+        <w:tc>
+          <w:tcPr>
+            <w:tcW w:w="1864" w:type="dxa"/>
+          </w:tcPr>
+          <w:p>
+            <w:pPr/>
+            <w:r>
+              <w:t>events: macroChance</w:t>
+            </w:r>
+          </w:p>
+        </w:tc>
+        <w:tc>
+          <w:tcPr>
+            <w:tcW w:w="1621" w:type="dxa"/>
+          </w:tcPr>
+          <w:p>
+            <w:pPr/>
+            <w:r>
+              <w:t>0.1</w:t>
+            </w:r>
+          </w:p>
+        </w:tc>
+        <w:tc>
+          <w:tcPr>
+            <w:tcW w:w="3700" w:type="dxa"/>
+          </w:tcPr>
+          <w:p>
+            <w:pPr/>
+            <w:r>
+              <w:t>The nightly chance a one-off macro shock starts when none is running.</w:t>
+            </w:r>
+          </w:p>
+        </w:tc>
+      </w:tr>
+      <w:tr>
+        <w:tc>
+          <w:tcPr>
+            <w:tcW w:w="2175" w:type="dxa"/>
+          </w:tcPr>
+          <w:p>
+            <w:pPr/>
+            <w:r>
               <w:t xml:space="preserve">Warn about bankruptcy sooner</w:t>
             </w:r>
           </w:p>
@@ -2741,7 +2879,7 @@
     <w:p>
       <w:pPr/>
       <w:r>
-        <w:t xml:space="preserve">As of 21 October 2026, MASTER CONFIG starts around line 635 and ends around line 1198 of DailyGrind\index.html. Use Ctrl+F to search for a part name, such as </w:t>
+        <w:t xml:space="preserve">As of 22 October 2026, MASTER CONFIG starts around line 635 and ends around line 1206 of DailyGrind\index.html. Use Ctrl+F to search for a part name, such as </w:t>
       </w:r>
       <w:r>
         <w:rPr>
@@ -2779,7 +2917,7 @@
     <w:p>
       <w:pPr/>
       <w:r>
-        <w:t>The three difficulty levels are set in a small table in the code, just below MASTER CONFIG (around line 1264 of index.html). They are not in MASTER CONFIG, so edit them there.</w:t>
+        <w:t>The three difficulty levels are set in a small table in the code, just below MASTER CONFIG (around line 1272 of index.html). They are not in MASTER CONFIG, so edit them there.</w:t>
       </w:r>
     </w:p>
     <w:tbl>

</xml_diff>

<commit_message>
Comfortable rank (the win line) at $1,000 instead of $2,000
Co-Authored-By: Claude Opus 5.5 <noreply@anthropic.com>
Claude-Session: https://claude.ai/code/session_01X4PpPPtrsCd6ZJRCWRgVNF
</commit_message>
<xml_diff>
--- a/docs/Daily Grind Config Guide.docx
+++ b/docs/Daily Grind Config Guide.docx
@@ -912,7 +912,7 @@
           <w:p>
             <w:pPr/>
             <w:r>
-              <w:t xml:space="preserve">Net-worth goals and target days: Comfortable $2,000 by day 8, Wealthy $5,000 by day 12, Tycoon $10,000 by day 15. Reaching one by its day adds a score bonus.</w:t>
+              <w:t>Net-worth goals and target days: Comfortable $1,000 by day 8, Wealthy $5,000 by day 12, Tycoon $10,000 by day 15. Reaching one by its day adds a score bonus.</w:t>
             </w:r>
           </w:p>
         </w:tc>
@@ -1593,7 +1593,7 @@
           <w:p>
             <w:pPr/>
             <w:r>
-              <w:t xml:space="preserve">2000</w:t>
+              <w:t>1000</w:t>
             </w:r>
           </w:p>
         </w:tc>

</xml_diff>

<commit_message>
Vital costs: study and self-study per hour, work happiness, walking and cooking energy, meal values, suit happiness, tasting energy
Co-Authored-By: Claude Opus 5.5 <noreply@anthropic.com>
Claude-Session: https://claude.ai/code/session_01X4PpPPtrsCd6ZJRCWRgVNF
</commit_message>
<xml_diff>
--- a/docs/Daily Grind Config Guide.docx
+++ b/docs/Daily Grind Config Guide.docx
@@ -13,7 +13,7 @@
     <w:p>
       <w:pPr/>
       <w:r>
-        <w:t>Oct 22, 2026</w:t>
+        <w:t>Oct 24, 2026</w:t>
       </w:r>
       <w:r>
         <w:t xml:space="preserve"> · </w:t>
@@ -2445,6 +2445,282 @@
           <w:p>
             <w:pPr/>
             <w:r>
+              <w:t>Make walking more or less tiring</w:t>
+            </w:r>
+          </w:p>
+        </w:tc>
+        <w:tc>
+          <w:tcPr>
+            <w:tcW w:w="1864" w:type="dxa"/>
+          </w:tcPr>
+          <w:p>
+            <w:pPr/>
+            <w:r>
+              <w:t>time: walkEnergy</w:t>
+            </w:r>
+          </w:p>
+        </w:tc>
+        <w:tc>
+          <w:tcPr>
+            <w:tcW w:w="1621" w:type="dxa"/>
+          </w:tcPr>
+          <w:p>
+            <w:pPr/>
+            <w:r>
+              <w:t>−2</w:t>
+            </w:r>
+          </w:p>
+        </w:tc>
+        <w:tc>
+          <w:tcPr>
+            <w:tcW w:w="3700" w:type="dxa"/>
+          </w:tcPr>
+          <w:p>
+            <w:pPr/>
+            <w:r>
+              <w:t>Energy (%) for every 15 minutes of walking between buildings.</w:t>
+            </w:r>
+          </w:p>
+        </w:tc>
+      </w:tr>
+      <w:tr>
+        <w:tc>
+          <w:tcPr>
+            <w:tcW w:w="2175" w:type="dxa"/>
+          </w:tcPr>
+          <w:p>
+            <w:pPr/>
+            <w:r>
+              <w:t>Change how much work hurts your mood</w:t>
+            </w:r>
+          </w:p>
+        </w:tc>
+        <w:tc>
+          <w:tcPr>
+            <w:tcW w:w="1864" w:type="dxa"/>
+          </w:tcPr>
+          <w:p>
+            <w:pPr/>
+            <w:r>
+              <w:t>time: workHappinessShare</w:t>
+            </w:r>
+          </w:p>
+        </w:tc>
+        <w:tc>
+          <w:tcPr>
+            <w:tcW w:w="1621" w:type="dxa"/>
+          </w:tcPr>
+          <w:p>
+            <w:pPr/>
+            <w:r>
+              <w:t>0.5</w:t>
+            </w:r>
+          </w:p>
+        </w:tc>
+        <w:tc>
+          <w:tcPr>
+            <w:tcW w:w="3700" w:type="dxa"/>
+          </w:tcPr>
+          <w:p>
+            <w:pPr/>
+            <w:r>
+              <w:t>A shift costs this share of its energy cost in happiness, rounded up. 0 switches it off.</w:t>
+            </w:r>
+          </w:p>
+        </w:tc>
+      </w:tr>
+      <w:tr>
+        <w:tc>
+          <w:tcPr>
+            <w:tcW w:w="2175" w:type="dxa"/>
+          </w:tcPr>
+          <w:p>
+            <w:pPr/>
+            <w:r>
+              <w:t>Change the cost of school lessons</w:t>
+            </w:r>
+          </w:p>
+        </w:tc>
+        <w:tc>
+          <w:tcPr>
+            <w:tcW w:w="1864" w:type="dxa"/>
+          </w:tcPr>
+          <w:p>
+            <w:pPr/>
+            <w:r>
+              <w:t>education: lessonEnergyPerHour, lessonHappinessPerHour</w:t>
+            </w:r>
+          </w:p>
+        </w:tc>
+        <w:tc>
+          <w:tcPr>
+            <w:tcW w:w="1621" w:type="dxa"/>
+          </w:tcPr>
+          <w:p>
+            <w:pPr/>
+            <w:r>
+              <w:t>−5, −5</w:t>
+            </w:r>
+          </w:p>
+        </w:tc>
+        <w:tc>
+          <w:tcPr>
+            <w:tcW w:w="3700" w:type="dxa"/>
+          </w:tcPr>
+          <w:p>
+            <w:pPr/>
+            <w:r>
+              <w:t>Energy (%) and happiness lost for each hour of a lesson.</w:t>
+            </w:r>
+          </w:p>
+        </w:tc>
+      </w:tr>
+      <w:tr>
+        <w:tc>
+          <w:tcPr>
+            <w:tcW w:w="2175" w:type="dxa"/>
+          </w:tcPr>
+          <w:p>
+            <w:pPr/>
+            <w:r>
+              <w:t>Change the cost of self-study</w:t>
+            </w:r>
+          </w:p>
+        </w:tc>
+        <w:tc>
+          <w:tcPr>
+            <w:tcW w:w="1864" w:type="dxa"/>
+          </w:tcPr>
+          <w:p>
+            <w:pPr/>
+            <w:r>
+              <w:t>selfStudy: energyPerHour, happinessPerHour</w:t>
+            </w:r>
+          </w:p>
+        </w:tc>
+        <w:tc>
+          <w:tcPr>
+            <w:tcW w:w="1621" w:type="dxa"/>
+          </w:tcPr>
+          <w:p>
+            <w:pPr/>
+            <w:r>
+              <w:t>−5, −5</w:t>
+            </w:r>
+          </w:p>
+        </w:tc>
+        <w:tc>
+          <w:tcPr>
+            <w:tcW w:w="3700" w:type="dxa"/>
+          </w:tcPr>
+          <w:p>
+            <w:pPr/>
+            <w:r>
+              <w:t>Energy (%) and happiness lost for each hour of self-study at home (health is selfStudy: health, −3 a session).</w:t>
+            </w:r>
+          </w:p>
+        </w:tc>
+      </w:tr>
+      <w:tr>
+        <w:tc>
+          <w:tcPr>
+            <w:tcW w:w="2175" w:type="dxa"/>
+          </w:tcPr>
+          <w:p>
+            <w:pPr/>
+            <w:r>
+              <w:t>Make cooking more or less tiring</w:t>
+            </w:r>
+          </w:p>
+        </w:tc>
+        <w:tc>
+          <w:tcPr>
+            <w:tcW w:w="1864" w:type="dxa"/>
+          </w:tcPr>
+          <w:p>
+            <w:pPr/>
+            <w:r>
+              <w:t>food: cookEnergy</w:t>
+            </w:r>
+          </w:p>
+        </w:tc>
+        <w:tc>
+          <w:tcPr>
+            <w:tcW w:w="1621" w:type="dxa"/>
+          </w:tcPr>
+          <w:p>
+            <w:pPr/>
+            <w:r>
+              <w:t>−5</w:t>
+            </w:r>
+          </w:p>
+        </w:tc>
+        <w:tc>
+          <w:tcPr>
+            <w:tcW w:w="3700" w:type="dxa"/>
+          </w:tcPr>
+          <w:p>
+            <w:pPr/>
+            <w:r>
+              <w:t>Energy (%) for every 3 hours of cooking, in proportion.</w:t>
+            </w:r>
+          </w:p>
+        </w:tc>
+      </w:tr>
+      <w:tr>
+        <w:tc>
+          <w:tcPr>
+            <w:tcW w:w="2175" w:type="dxa"/>
+          </w:tcPr>
+          <w:p>
+            <w:pPr/>
+            <w:r>
+              <w:t>Change what a home meal gives</w:t>
+            </w:r>
+          </w:p>
+        </w:tc>
+        <w:tc>
+          <w:tcPr>
+            <w:tcW w:w="1864" w:type="dxa"/>
+          </w:tcPr>
+          <w:p>
+            <w:pPr/>
+            <w:r>
+              <w:t>food: basic / premium, energy and health</w:t>
+            </w:r>
+          </w:p>
+        </w:tc>
+        <w:tc>
+          <w:tcPr>
+            <w:tcW w:w="1621" w:type="dxa"/>
+          </w:tcPr>
+          <w:p>
+            <w:pPr/>
+            <w:r>
+              <w:t>15 / 10 and 12 / 5</w:t>
+            </w:r>
+          </w:p>
+        </w:tc>
+        <w:tc>
+          <w:tcPr>
+            <w:tcW w:w="3700" w:type="dxa"/>
+          </w:tcPr>
+          <w:p>
+            <w:pPr/>
+            <w:r>
+              <w:t>Cooked meal (basic) and ready-to-eat meal (premium).</w:t>
+            </w:r>
+          </w:p>
+        </w:tc>
+      </w:tr>
+      <w:tr>
+        <w:tc>
+          <w:tcPr>
+            <w:tcW w:w="2175" w:type="dxa"/>
+          </w:tcPr>
+          <w:p>
+            <w:pPr/>
+            <w:r>
               <w:t xml:space="preserve">Stop all starting traits</w:t>
             </w:r>
           </w:p>
@@ -2675,7 +2951,7 @@
           <w:p>
             <w:pPr/>
             <w:r>
-              <w:t>Long sessions cost 6% energy, and burnout starts after 9 hours of work and study a day.</w:t>
+              <w:t>Self-study costs 8% energy an hour instead of 5%, and burnout starts after 9 hours of work and study a day.</w:t>
             </w:r>
           </w:p>
         </w:tc>
@@ -2879,7 +3155,7 @@
     <w:p>
       <w:pPr/>
       <w:r>
-        <w:t xml:space="preserve">As of 22 October 2026, MASTER CONFIG starts around line 635 and ends around line 1206 of DailyGrind\index.html. Use Ctrl+F to search for a part name, such as </w:t>
+        <w:t xml:space="preserve">As of 24 October 2026, MASTER CONFIG starts around line 695 and ends around line 1272 of DailyGrind\index.html. Use Ctrl+F to search for a part name, such as </w:t>
       </w:r>
       <w:r>
         <w:rPr>
@@ -2917,7 +3193,7 @@
     <w:p>
       <w:pPr/>
       <w:r>
-        <w:t>The three difficulty levels are set in a small table in the code, just below MASTER CONFIG (around line 1272 of index.html). They are not in MASTER CONFIG, so edit them there.</w:t>
+        <w:t>The three difficulty levels are set in a small table in the code, just below MASTER CONFIG (around line 1338 of index.html). They are not in MASTER CONFIG, so edit them there.</w:t>
       </w:r>
     </w:p>
     <w:tbl>

</xml_diff>

<commit_message>
Soften vital costs: walking 1% per 15 min, cooked and ready-to-eat meals +20% energy
Co-Authored-By: Claude Opus 5.5 <noreply@anthropic.com>
Claude-Session: https://claude.ai/code/session_01X4PpPPtrsCd6ZJRCWRgVNF
</commit_message>
<xml_diff>
--- a/docs/Daily Grind Config Guide.docx
+++ b/docs/Daily Grind Config Guide.docx
@@ -2467,7 +2467,7 @@
           <w:p>
             <w:pPr/>
             <w:r>
-              <w:t>−2</w:t>
+              <w:t>−1</w:t>
             </w:r>
           </w:p>
         </w:tc>
@@ -2697,7 +2697,7 @@
           <w:p>
             <w:pPr/>
             <w:r>
-              <w:t>15 / 10 and 12 / 5</w:t>
+              <w:t>20 / 10 and 20 / 5</w:t>
             </w:r>
           </w:p>
         </w:tc>

</xml_diff>

<commit_message>
Free time: home activities, the Park, and coffee and cake (CHANGELOG 54)
Co-Authored-By: Claude Opus 5.5 <noreply@anthropic.com>
Claude-Session: https://claude.ai/code/session_01X4PpPPtrsCd6ZJRCWRgVNF
</commit_message>
<xml_diff>
--- a/docs/Daily Grind Config Guide.docx
+++ b/docs/Daily Grind Config Guide.docx
@@ -749,6 +749,41 @@
             <w:pPr/>
             <w:r>
               <w:t xml:space="preserve">ticketCost:10</w:t>
+            </w:r>
+          </w:p>
+        </w:tc>
+      </w:tr>
+      <w:tr>
+        <w:tc>
+          <w:tcPr>
+            <w:tcW w:w="1225" w:type="dxa"/>
+          </w:tcPr>
+          <w:p>
+            <w:pPr/>
+            <w:r>
+              <w:t xml:space="preserve">leisure</w:t>
+            </w:r>
+          </w:p>
+        </w:tc>
+        <w:tc>
+          <w:tcPr>
+            <w:tcW w:w="4920" w:type="dxa"/>
+          </w:tcPr>
+          <w:p>
+            <w:pPr/>
+            <w:r>
+              <w:t xml:space="preserve">Free-time activities: watching a show or gaming and calling family at home, walking and jogging at the Park</w:t>
+            </w:r>
+          </w:p>
+        </w:tc>
+        <w:tc>
+          <w:tcPr>
+            <w:tcW w:w="3215" w:type="dxa"/>
+          </w:tcPr>
+          <w:p>
+            <w:pPr/>
+            <w:r>
+              <w:t xml:space="preserve">walk: minutes:60, happiness:5</w:t>
             </w:r>
           </w:p>
         </w:tc>
@@ -2721,6 +2756,98 @@
           <w:p>
             <w:pPr/>
             <w:r>
+              <w:t>Change the free-time activities</w:t>
+            </w:r>
+          </w:p>
+        </w:tc>
+        <w:tc>
+          <w:tcPr>
+            <w:tcW w:w="1864" w:type="dxa"/>
+          </w:tcPr>
+          <w:p>
+            <w:pPr/>
+            <w:r>
+              <w:t>leisure: screen, call, walk, jog</w:t>
+            </w:r>
+          </w:p>
+        </w:tc>
+        <w:tc>
+          <w:tcPr>
+            <w:tcW w:w="1621" w:type="dxa"/>
+          </w:tcPr>
+          <w:p>
+            <w:pPr/>
+            <w:r>
+              <w:t>see right</w:t>
+            </w:r>
+          </w:p>
+        </w:tc>
+        <w:tc>
+          <w:tcPr>
+            <w:tcW w:w="3700" w:type="dxa"/>
+          </w:tcPr>
+          <w:p>
+            <w:pPr/>
+            <w:r>
+              <w:t>Time (minutes), happiness, health and energy for watching a show or gaming at home (needs a TV or console), calling family (perDay times a day), and walking or jogging at the Park. jog: minEnergy is the energy needed to jog.</w:t>
+            </w:r>
+          </w:p>
+        </w:tc>
+      </w:tr>
+      <w:tr>
+        <w:tc>
+          <w:tcPr>
+            <w:tcW w:w="2175" w:type="dxa"/>
+          </w:tcPr>
+          <w:p>
+            <w:pPr/>
+            <w:r>
+              <w:t>Change coffee and cake</w:t>
+            </w:r>
+          </w:p>
+        </w:tc>
+        <w:tc>
+          <w:tcPr>
+            <w:tcW w:w="1864" w:type="dxa"/>
+          </w:tcPr>
+          <w:p>
+            <w:pPr/>
+            <w:r>
+              <w:t>food: cafe</w:t>
+            </w:r>
+          </w:p>
+        </w:tc>
+        <w:tc>
+          <w:tcPr>
+            <w:tcW w:w="1621" w:type="dxa"/>
+          </w:tcPr>
+          <w:p>
+            <w:pPr/>
+            <w:r>
+              <w:t>45 min, $12, +3 energy, +6 happiness</w:t>
+            </w:r>
+          </w:p>
+        </w:tc>
+        <w:tc>
+          <w:tcPr>
+            <w:tcW w:w="3700" w:type="dxa"/>
+          </w:tcPr>
+          <w:p>
+            <w:pPr/>
+            <w:r>
+              <w:t>The Restaurant snack. snack: true means it does not count as your daily meal.</w:t>
+            </w:r>
+          </w:p>
+        </w:tc>
+      </w:tr>
+      <w:tr>
+        <w:tc>
+          <w:tcPr>
+            <w:tcW w:w="2175" w:type="dxa"/>
+          </w:tcPr>
+          <w:p>
+            <w:pPr/>
+            <w:r>
               <w:t xml:space="preserve">Stop all starting traits</w:t>
             </w:r>
           </w:p>
@@ -3155,7 +3282,7 @@
     <w:p>
       <w:pPr/>
       <w:r>
-        <w:t xml:space="preserve">As of 24 October 2026, MASTER CONFIG starts around line 695 and ends around line 1272 of DailyGrind\index.html. Use Ctrl+F to search for a part name, such as </w:t>
+        <w:t xml:space="preserve">As of 24 October 2026, MASTER CONFIG starts around line 696 and ends around line 1284 of DailyGrind\index.html. Use Ctrl+F to search for a part name, such as </w:t>
       </w:r>
       <w:r>
         <w:rPr>
@@ -3193,7 +3320,7 @@
     <w:p>
       <w:pPr/>
       <w:r>
-        <w:t>The three difficulty levels are set in a small table in the code, just below MASTER CONFIG (around line 1338 of index.html). They are not in MASTER CONFIG, so edit them there.</w:t>
+        <w:t>The three difficulty levels are set in a small table in the code, just below MASTER CONFIG (around line 1350 of index.html). They are not in MASTER CONFIG, so edit them there.</w:t>
       </w:r>
     </w:p>
     <w:tbl>

</xml_diff>

<commit_message>
Interview pop-ups leave a second sooner (CHANGELOG 55)
Co-Authored-By: Claude Opus 5.5 <noreply@anthropic.com>
Claude-Session: https://claude.ai/code/session_01X4PpPPtrsCd6ZJRCWRgVNF
</commit_message>
<xml_diff>
--- a/docs/Daily Grind Config Guide.docx
+++ b/docs/Daily Grind Config Guide.docx
@@ -2848,6 +2848,52 @@
           <w:p>
             <w:pPr/>
             <w:r>
+              <w:t>Make the interview pop-ups shorter or longer</w:t>
+            </w:r>
+          </w:p>
+        </w:tc>
+        <w:tc>
+          <w:tcPr>
+            <w:tcW w:w="1864" w:type="dxa"/>
+          </w:tcPr>
+          <w:p>
+            <w:pPr/>
+            <w:r>
+              <w:t>ui: toasts: shorter</w:t>
+            </w:r>
+          </w:p>
+        </w:tc>
+        <w:tc>
+          <w:tcPr>
+            <w:tcW w:w="1621" w:type="dxa"/>
+          </w:tcPr>
+          <w:p>
+            <w:pPr/>
+            <w:r>
+              <w:t>seconds:1</w:t>
+            </w:r>
+          </w:p>
+        </w:tc>
+        <w:tc>
+          <w:tcPr>
+            <w:tcW w:w="3700" w:type="dxa"/>
+          </w:tcPr>
+          <w:p>
+            <w:pPr/>
+            <w:r>
+              <w:t>Interview result pop-ups (passed or failed) leave this many seconds sooner than other pop-ups. words lists the phrases it applies to; 0 switches it off.</w:t>
+            </w:r>
+          </w:p>
+        </w:tc>
+      </w:tr>
+      <w:tr>
+        <w:tc>
+          <w:tcPr>
+            <w:tcW w:w="2175" w:type="dxa"/>
+          </w:tcPr>
+          <w:p>
+            <w:pPr/>
+            <w:r>
               <w:t xml:space="preserve">Stop all starting traits</w:t>
             </w:r>
           </w:p>
@@ -3282,7 +3328,7 @@
     <w:p>
       <w:pPr/>
       <w:r>
-        <w:t xml:space="preserve">As of 24 October 2026, MASTER CONFIG starts around line 696 and ends around line 1284 of DailyGrind\index.html. Use Ctrl+F to search for a part name, such as </w:t>
+        <w:t xml:space="preserve">As of 24 October 2026, MASTER CONFIG starts around line 696 and ends around line 1285 of DailyGrind\index.html. Use Ctrl+F to search for a part name, such as </w:t>
       </w:r>
       <w:r>
         <w:rPr>
@@ -3320,7 +3366,7 @@
     <w:p>
       <w:pPr/>
       <w:r>
-        <w:t>The three difficulty levels are set in a small table in the code, just below MASTER CONFIG (around line 1350 of index.html). They are not in MASTER CONFIG, so edit them there.</w:t>
+        <w:t>The three difficulty levels are set in a small table in the code, just below MASTER CONFIG (around line 1351 of index.html). They are not in MASTER CONFIG, so edit them there.</w:t>
       </w:r>
     </w:p>
     <w:tbl>

</xml_diff>

<commit_message>
Free time, self-study, gym classes, Factory options, qualification bonus, shorter classes, gentler nights (CHANGELOG 56-59)
- Watch a show: -1% energy, +7 happiness. Self-study 2h with costs cut by a third.
- Gym: five classes with distinct roles (yoga, boxing, strength, spin, sauna), moved into CONFIG.gym.
- Factory: day labour, safety course and tour for people without a job there (CONFIG.factory).
- Qualification bonus by level: +5/+10/+15/+20 knowledge and happiness.
- Class time: Degree 12h, Honours 8h, Masters 6h.
- Nightly change 0 energy, -5 happiness, 0 health, -2 knowledge; comfort items +5% each.

Co-Authored-By: Claude Opus 5.5 <noreply@anthropic.com>
Claude-Session: https://claude.ai/code/session_01X4PpPPtrsCd6ZJRCWRgVNF
</commit_message>
<xml_diff>
--- a/docs/Daily Grind Config Guide.docx
+++ b/docs/Daily Grind Config Guide.docx
@@ -597,7 +597,7 @@
           <w:p>
             <w:pPr/>
             <w:r>
-              <w:t xml:space="preserve">Knowledge from studying at home and how fast you forget</w:t>
+              <w:t xml:space="preserve">Knowledge from studying at home, session length (minutes: 120) and how fast you forget</w:t>
             </w:r>
           </w:p>
         </w:tc>
@@ -784,6 +784,76 @@
             <w:pPr/>
             <w:r>
               <w:t xml:space="preserve">walk: minutes:60, happiness:5</w:t>
+            </w:r>
+          </w:p>
+        </w:tc>
+      </w:tr>
+      <w:tr>
+        <w:tc>
+          <w:tcPr>
+            <w:tcW w:w="1225" w:type="dxa"/>
+          </w:tcPr>
+          <w:p>
+            <w:pPr/>
+            <w:r>
+              <w:t xml:space="preserve">gym</w:t>
+            </w:r>
+          </w:p>
+        </w:tc>
+        <w:tc>
+          <w:tcPr>
+            <w:tcW w:w="4920" w:type="dxa"/>
+          </w:tcPr>
+          <w:p>
+            <w:pPr/>
+            <w:r>
+              <w:t xml:space="preserve">Gym classes: time, cost, energy, health, happiness and how many workouts each counts as</w:t>
+            </w:r>
+          </w:p>
+        </w:tc>
+        <w:tc>
+          <w:tcPr>
+            <w:tcW w:w="3215" w:type="dxa"/>
+          </w:tcPr>
+          <w:p>
+            <w:pPr/>
+            <w:r>
+              <w:t xml:space="preserve">minEnergy:15</w:t>
+            </w:r>
+          </w:p>
+        </w:tc>
+      </w:tr>
+      <w:tr>
+        <w:tc>
+          <w:tcPr>
+            <w:tcW w:w="1225" w:type="dxa"/>
+          </w:tcPr>
+          <w:p>
+            <w:pPr/>
+            <w:r>
+              <w:t xml:space="preserve">factory</w:t>
+            </w:r>
+          </w:p>
+        </w:tc>
+        <w:tc>
+          <w:tcPr>
+            <w:tcW w:w="4920" w:type="dxa"/>
+          </w:tcPr>
+          <w:p>
+            <w:pPr/>
+            <w:r>
+              <w:t xml:space="preserve">Day labour, safety course and tour at the Factory for people without a job there</w:t>
+            </w:r>
+          </w:p>
+        </w:tc>
+        <w:tc>
+          <w:tcPr>
+            <w:tcW w:w="3215" w:type="dxa"/>
+          </w:tcPr>
+          <w:p>
+            <w:pPr/>
+            <w:r>
+              <w:t xml:space="preserve">dayLabour: minutes:240, payShare:0.6</w:t>
             </w:r>
           </w:p>
         </w:tc>
@@ -2651,7 +2721,7 @@
           <w:p>
             <w:pPr/>
             <w:r>
-              <w:t>Energy (%) and happiness lost for each hour of self-study at home (health is selfStudy: health, −3 a session).</w:t>
+              <w:t>Energy (%) and happiness lost for each hour of self-study at home (health is selfStudy: health, −2 a session). A session lasts selfStudy: minutes (120).</w:t>
             </w:r>
           </w:p>
         </w:tc>
@@ -2836,6 +2906,236 @@
             <w:pPr/>
             <w:r>
               <w:t>The Restaurant snack. snack: true means it does not count as your daily meal.</w:t>
+            </w:r>
+          </w:p>
+        </w:tc>
+      </w:tr>
+      <w:tr>
+        <w:tc>
+          <w:tcPr>
+            <w:tcW w:w="2175" w:type="dxa"/>
+          </w:tcPr>
+          <w:p>
+            <w:pPr/>
+            <w:r>
+              <w:t>Change what every night takes away</w:t>
+            </w:r>
+          </w:p>
+        </w:tc>
+        <w:tc>
+          <w:tcPr>
+            <w:tcW w:w="1864" w:type="dxa"/>
+          </w:tcPr>
+          <w:p>
+            <w:pPr/>
+            <w:r>
+              <w:t>sleep: nightEnergy, nightHappiness; health: nightly: always; selfStudy: nightlyLoss</w:t>
+            </w:r>
+          </w:p>
+        </w:tc>
+        <w:tc>
+          <w:tcPr>
+            <w:tcW w:w="1621" w:type="dxa"/>
+          </w:tcPr>
+          <w:p>
+            <w:pPr/>
+            <w:r>
+              <w:t>0, −5, 0, −2</w:t>
+            </w:r>
+          </w:p>
+        </w:tc>
+        <w:tc>
+          <w:tcPr>
+            <w:tcW w:w="3700" w:type="dxa"/>
+          </w:tcPr>
+          <w:p>
+            <w:pPr/>
+            <w:r>
+              <w:t>The fixed change every night before sleep is added back: energy (%), happiness, health and knowledge. 0 switches one off.</w:t>
+            </w:r>
+          </w:p>
+        </w:tc>
+      </w:tr>
+      <w:tr>
+        <w:tc>
+          <w:tcPr>
+            <w:tcW w:w="2175" w:type="dxa"/>
+          </w:tcPr>
+          <w:p>
+            <w:pPr/>
+            <w:r>
+              <w:t>Change how much comfort items help</w:t>
+            </w:r>
+          </w:p>
+        </w:tc>
+        <w:tc>
+          <w:tcPr>
+            <w:tcW w:w="1864" w:type="dxa"/>
+          </w:tcPr>
+          <w:p>
+            <w:pPr/>
+            <w:r>
+              <w:t>sleep: comfortBonus</w:t>
+            </w:r>
+          </w:p>
+        </w:tc>
+        <w:tc>
+          <w:tcPr>
+            <w:tcW w:w="1621" w:type="dxa"/>
+          </w:tcPr>
+          <w:p>
+            <w:pPr/>
+            <w:r>
+              <w:t>0.05</w:t>
+            </w:r>
+          </w:p>
+        </w:tc>
+        <w:tc>
+          <w:tcPr>
+            <w:tcW w:w="3700" w:type="dxa"/>
+          </w:tcPr>
+          <w:p>
+            <w:pPr/>
+            <w:r>
+              <w:t>Each comfort item at home (TV, console, fridge, coffee machine, computer) makes resting and sleep restore this much more energy (0.05 = 5%).</w:t>
+            </w:r>
+          </w:p>
+        </w:tc>
+      </w:tr>
+      <w:tr>
+        <w:tc>
+          <w:tcPr>
+            <w:tcW w:w="2175" w:type="dxa"/>
+          </w:tcPr>
+          <w:p>
+            <w:pPr/>
+            <w:r>
+              <w:t>Change the qualification bonus</w:t>
+            </w:r>
+          </w:p>
+        </w:tc>
+        <w:tc>
+          <w:tcPr>
+            <w:tcW w:w="1864" w:type="dxa"/>
+          </w:tcPr>
+          <w:p>
+            <w:pPr/>
+            <w:r>
+              <w:t>education: certKnowledge, certHappiness</w:t>
+            </w:r>
+          </w:p>
+        </w:tc>
+        <w:tc>
+          <w:tcPr>
+            <w:tcW w:w="1621" w:type="dxa"/>
+          </w:tcPr>
+          <w:p>
+            <w:pPr/>
+            <w:r>
+              <w:t>Certificate 5, Degree 10, Honours 15, Masters 20 (both)</w:t>
+            </w:r>
+          </w:p>
+        </w:tc>
+        <w:tc>
+          <w:tcPr>
+            <w:tcW w:w="3700" w:type="dxa"/>
+          </w:tcPr>
+          <w:p>
+            <w:pPr/>
+            <w:r>
+              <w:t>Knowledge and happiness added when you earn a qualification (when the certificate pops up), by level. 0 switches a level off.</w:t>
+            </w:r>
+          </w:p>
+        </w:tc>
+      </w:tr>
+      <w:tr>
+        <w:tc>
+          <w:tcPr>
+            <w:tcW w:w="2175" w:type="dxa"/>
+          </w:tcPr>
+          <w:p>
+            <w:pPr/>
+            <w:r>
+              <w:t>Change the gym classes</w:t>
+            </w:r>
+          </w:p>
+        </w:tc>
+        <w:tc>
+          <w:tcPr>
+            <w:tcW w:w="1864" w:type="dxa"/>
+          </w:tcPr>
+          <w:p>
+            <w:pPr/>
+            <w:r>
+              <w:t>gym: classes</w:t>
+            </w:r>
+          </w:p>
+        </w:tc>
+        <w:tc>
+          <w:tcPr>
+            <w:tcW w:w="1621" w:type="dxa"/>
+          </w:tcPr>
+          <w:p>
+            <w:pPr/>
+            <w:r>
+              <w:t>see right</w:t>
+            </w:r>
+          </w:p>
+        </w:tc>
+        <w:tc>
+          <w:tcPr>
+            <w:tcW w:w="3700" w:type="dxa"/>
+          </w:tcPr>
+          <w:p>
+            <w:pPr/>
+            <w:r>
+              <w:t>One line per class: minutes, cost, energy change (negative costs energy, positive gives it back), health, happiness, and workouts (how many visits it counts as for illness protection; 0 = not a workout). gym: minEnergy is the energy needed for a class that costs energy.</w:t>
+            </w:r>
+          </w:p>
+        </w:tc>
+      </w:tr>
+      <w:tr>
+        <w:tc>
+          <w:tcPr>
+            <w:tcW w:w="2175" w:type="dxa"/>
+          </w:tcPr>
+          <w:p>
+            <w:pPr/>
+            <w:r>
+              <w:t>Change the Factory options for people without a job there</w:t>
+            </w:r>
+          </w:p>
+        </w:tc>
+        <w:tc>
+          <w:tcPr>
+            <w:tcW w:w="1864" w:type="dxa"/>
+          </w:tcPr>
+          <w:p>
+            <w:pPr/>
+            <w:r>
+              <w:t>factory: dayLabour, course, tour</w:t>
+            </w:r>
+          </w:p>
+        </w:tc>
+        <w:tc>
+          <w:tcPr>
+            <w:tcW w:w="1621" w:type="dxa"/>
+          </w:tcPr>
+          <w:p>
+            <w:pPr/>
+            <w:r>
+              <w:t>see right</w:t>
+            </w:r>
+          </w:p>
+        </w:tc>
+        <w:tc>
+          <w:tcPr>
+            <w:tcW w:w="3700" w:type="dxa"/>
+          </w:tcPr>
+          <w:p>
+            <w:pPr/>
+            <w:r>
+              <w:t>dayLabour: minutes, payShare (share of the lowest Factory wage), energy, perDay. course: minutes, cost, knowledge, expShifts (shifts of work experience it counts as). tour: minutes, cost, knowledge, happiness.</w:t>
             </w:r>
           </w:p>
         </w:tc>
@@ -3328,7 +3628,7 @@
     <w:p>
       <w:pPr/>
       <w:r>
-        <w:t xml:space="preserve">As of 24 October 2026, MASTER CONFIG starts around line 696 and ends around line 1285 of DailyGrind\index.html. Use Ctrl+F to search for a part name, such as </w:t>
+        <w:t xml:space="preserve">As of 24 October 2026, MASTER CONFIG starts around line 697 and ends around line 1314 of DailyGrind\index.html. Use Ctrl+F to search for a part name, such as </w:t>
       </w:r>
       <w:r>
         <w:rPr>
@@ -3366,7 +3666,7 @@
     <w:p>
       <w:pPr/>
       <w:r>
-        <w:t>The three difficulty levels are set in a small table in the code, just below MASTER CONFIG (around line 1351 of index.html). They are not in MASTER CONFIG, so edit them there.</w:t>
+        <w:t>The three difficulty levels are set in a small table in the code, just below MASTER CONFIG (around line 1380 of index.html). They are not in MASTER CONFIG, so edit them there.</w:t>
       </w:r>
     </w:p>
     <w:tbl>

</xml_diff>

<commit_message>
No nearly-broke warning or penalty in the first five days; money shame in CONFIG (CHANGELOG 66)
Co-Authored-By: Claude Opus 5.5 <noreply@anthropic.com>
Claude-Session: https://claude.ai/code/session_01X4PpPPtrsCd6ZJRCWRgVNF
</commit_message>
<xml_diff>
--- a/docs/Daily Grind Config Guide.docx
+++ b/docs/Daily Grind Config Guide.docx
@@ -2918,6 +2918,52 @@
           <w:p>
             <w:pPr/>
             <w:r>
+              <w:t>Change money shame</w:t>
+            </w:r>
+          </w:p>
+        </w:tc>
+        <w:tc>
+          <w:tcPr>
+            <w:tcW w:w="1864" w:type="dxa"/>
+          </w:tcPr>
+          <w:p>
+            <w:pPr/>
+            <w:r>
+              <w:t>shame: nearlyBrokeBelow, nearlyBrokeHappiness, nearlyBrokeFromDay, debtHappiness, debtEnergy</w:t>
+            </w:r>
+          </w:p>
+        </w:tc>
+        <w:tc>
+          <w:tcPr>
+            <w:tcW w:w="1621" w:type="dxa"/>
+          </w:tcPr>
+          <w:p>
+            <w:pPr/>
+            <w:r>
+              <w:t>100, −3, 6, −8, −5</w:t>
+            </w:r>
+          </w:p>
+        </w:tc>
+        <w:tc>
+          <w:tcPr>
+            <w:tcW w:w="3700" w:type="dxa"/>
+          </w:tcPr>
+          <w:p>
+            <w:pPr/>
+            <w:r>
+              <w:t>Checked when you end the day. Nearly broke (net worth under nearlyBrokeBelow) costs nearlyBrokeHappiness, only from day nearlyBrokeFromDay. In debt (under 0) costs debtHappiness and debtEnergy from day 1.</w:t>
+            </w:r>
+          </w:p>
+        </w:tc>
+      </w:tr>
+      <w:tr>
+        <w:tc>
+          <w:tcPr>
+            <w:tcW w:w="2175" w:type="dxa"/>
+          </w:tcPr>
+          <w:p>
+            <w:pPr/>
+            <w:r>
               <w:t>Change what every night takes away</w:t>
             </w:r>
           </w:p>
@@ -3628,7 +3674,7 @@
     <w:p>
       <w:pPr/>
       <w:r>
-        <w:t xml:space="preserve">As of 24 October 2026, MASTER CONFIG starts around line 697 and ends around line 1314 of DailyGrind\index.html. Use Ctrl+F to search for a part name, such as </w:t>
+        <w:t xml:space="preserve">As of 24 October 2026, MASTER CONFIG starts around line 712 and ends around line 1336 of DailyGrind\index.html. Use Ctrl+F to search for a part name, such as </w:t>
       </w:r>
       <w:r>
         <w:rPr>
@@ -3666,7 +3712,7 @@
     <w:p>
       <w:pPr/>
       <w:r>
-        <w:t>The three difficulty levels are set in a small table in the code, just below MASTER CONFIG (around line 1380 of index.html). They are not in MASTER CONFIG, so edit them there.</w:t>
+        <w:t>The three difficulty levels are set in a small table in the code, just below MASTER CONFIG (around line 1402 of index.html). They are not in MASTER CONFIG, so edit them there.</w:t>
       </w:r>
     </w:p>
     <w:tbl>

</xml_diff>

<commit_message>
Faster sleep at home: 6.5%/h Apartment, 9%/h Bungalow, cap 75% (CHANGELOG 67)
Co-Authored-By: Claude Opus 5.5 <noreply@anthropic.com>
Claude-Session: https://claude.ai/code/session_01X4PpPPtrsCd6ZJRCWRgVNF
</commit_message>
<xml_diff>
--- a/docs/Daily Grind Config Guide.docx
+++ b/docs/Daily Grind Config Guide.docx
@@ -2331,7 +2331,7 @@
           <w:p>
             <w:pPr/>
             <w:r>
-              <w:t>sleep: energyX</w:t>
+              <w:t>sleep: perHour</w:t>
             </w:r>
           </w:p>
         </w:tc>
@@ -2342,7 +2342,7 @@
           <w:p>
             <w:pPr/>
             <w:r>
-              <w:t>1.5</w:t>
+              <w:t>apt 6.5, bung 9</w:t>
             </w:r>
           </w:p>
         </w:tc>
@@ -2353,7 +2353,7 @@
           <w:p>
             <w:pPr/>
             <w:r>
-              <w:t>How many times faster a night’s sleep restores energy than resting. maxEnergy (52) caps one night.</w:t>
+              <w:t>Energy (%) a night’s sleep at home restores for each hour left in the day, for the Apartment and the Bungalow (comfort items add to it). maxEnergy (75) caps one night. The 2h rest uses the home’s own rest rate.</w:t>
             </w:r>
           </w:p>
         </w:tc>

</xml_diff>

<commit_message>
Kitchen buttons, max 2 toasts, work and study cost health, home meals heal less (CHANGELOG 69-70)
Co-Authored-By: Claude Opus 5.5 <noreply@anthropic.com>
Claude-Session: https://claude.ai/code/session_01X4PpPPtrsCd6ZJRCWRgVNF
</commit_message>
<xml_diff>
--- a/docs/Daily Grind Config Guide.docx
+++ b/docs/Daily Grind Config Guide.docx
@@ -2721,7 +2721,7 @@
           <w:p>
             <w:pPr/>
             <w:r>
-              <w:t>Energy (%) and happiness lost for each hour of self-study at home (health is selfStudy: health, −2 a session). A session lasts selfStudy: minutes (120).</w:t>
+              <w:t>Energy (%) and happiness lost for each hour of self-study at home (health is selfStudy: healthPerHour, −1 an hour). A session lasts selfStudy: minutes (120).</w:t>
             </w:r>
           </w:p>
         </w:tc>
@@ -2802,7 +2802,7 @@
           <w:p>
             <w:pPr/>
             <w:r>
-              <w:t>20 / 10 and 20 / 5</w:t>
+              <w:t>20 / 5 and 20 / 1</w:t>
             </w:r>
           </w:p>
         </w:tc>
@@ -2906,6 +2906,52 @@
             <w:pPr/>
             <w:r>
               <w:t>The Restaurant snack. snack: true means it does not count as your daily meal.</w:t>
+            </w:r>
+          </w:p>
+        </w:tc>
+      </w:tr>
+      <w:tr>
+        <w:tc>
+          <w:tcPr>
+            <w:tcW w:w="2175" w:type="dxa"/>
+          </w:tcPr>
+          <w:p>
+            <w:pPr/>
+            <w:r>
+              <w:t>Change how much work and study wear down health</w:t>
+            </w:r>
+          </w:p>
+        </w:tc>
+        <w:tc>
+          <w:tcPr>
+            <w:tcW w:w="1864" w:type="dxa"/>
+          </w:tcPr>
+          <w:p>
+            <w:pPr/>
+            <w:r>
+              <w:t>time: workHealthPerHour; education: lessonHealthPerHour; selfStudy: healthPerHour</w:t>
+            </w:r>
+          </w:p>
+        </w:tc>
+        <w:tc>
+          <w:tcPr>
+            <w:tcW w:w="1621" w:type="dxa"/>
+          </w:tcPr>
+          <w:p>
+            <w:pPr/>
+            <w:r>
+              <w:t>−1, −1, −1</w:t>
+            </w:r>
+          </w:p>
+        </w:tc>
+        <w:tc>
+          <w:tcPr>
+            <w:tcW w:w="3700" w:type="dxa"/>
+          </w:tcPr>
+          <w:p>
+            <w:pPr/>
+            <w:r>
+              <w:t>Health for each hour of work (shifts, freelance coding, Factory day labour), school lessons and self-study, rounded per action (a half counts as a whole point). 0 switches one off.</w:t>
             </w:r>
           </w:p>
         </w:tc>
@@ -3674,7 +3720,7 @@
     <w:p>
       <w:pPr/>
       <w:r>
-        <w:t xml:space="preserve">As of 24 October 2026, MASTER CONFIG starts around line 712 and ends around line 1336 of DailyGrind\index.html. Use Ctrl+F to search for a part name, such as </w:t>
+        <w:t xml:space="preserve">As of 24 October 2026, MASTER CONFIG starts around line 713 and ends around line 1342 of DailyGrind\index.html. Use Ctrl+F to search for a part name, such as </w:t>
       </w:r>
       <w:r>
         <w:rPr>
@@ -3712,7 +3758,7 @@
     <w:p>
       <w:pPr/>
       <w:r>
-        <w:t>The three difficulty levels are set in a small table in the code, just below MASTER CONFIG (around line 1402 of index.html). They are not in MASTER CONFIG, so edit them there.</w:t>
+        <w:t>The three difficulty levels are set in a small table in the code, just below MASTER CONFIG (around line 1408 of index.html). They are not in MASTER CONFIG, so edit them there.</w:t>
       </w:r>
     </w:p>
     <w:tbl>

</xml_diff>

<commit_message>
Games last 20 days; one storyline, kept 2 days apart from macro shocks
- gameDays 15 -> 20; rank target days 10/16/20 (were 8/12/15).
- Exactly one storyline a game, starting between day fromDay (3) and
  daysBeforeEnd (3) days before the end; toDay and gapDays removed.
- New CONFIG.events.storylineGap (2): macro shocks never overlap the
  storyline and keep 2 clear days from it, before and after.
- Old saves: a finished storyline is not repeated.
- CHANGELOG 72 and Config Guide updated.

Co-Authored-By: Claude Opus 5.5 <noreply@anthropic.com>
Claude-Session: https://claude.ai/code/session_01X4PpPPtrsCd6ZJRCWRgVNF
</commit_message>
<xml_diff>
--- a/docs/Daily Grind Config Guide.docx
+++ b/docs/Daily Grind Config Guide.docx
@@ -352,7 +352,7 @@
           <w:p>
             <w:pPr/>
             <w:r>
-              <w:t>Length of the day, walking, rent every 5 days, game length of 15 days, shift length by pay, how long actions take</w:t>
+              <w:t>Length of the day, walking, rent every 5 days, game length of 20 days, shift length by pay, how long actions take</w:t>
             </w:r>
           </w:p>
         </w:tc>
@@ -877,7 +877,7 @@
           <w:p>
             <w:pPr/>
             <w:r>
-              <w:t>Which event happens each night: one storyline a game (start window and gap), the chance of a macro shock, the daily event odds, and how often a news headline is tipped off that morning</w:t>
+              <w:t>Which event happens each night: one storyline a game (start window and its gap from macro shocks), the chance of a macro shock, the daily event odds, and how often a news headline is tipped off that morning</w:t>
             </w:r>
           </w:p>
         </w:tc>
@@ -888,7 +888,7 @@
           <w:p>
             <w:pPr/>
             <w:r>
-              <w:t>storyline: fromDay:2, toDay:8</w:t>
+              <w:t>storyline: fromDay:3, daysBeforeEnd:3; storylineGap:2</w:t>
             </w:r>
           </w:p>
         </w:tc>
@@ -1017,7 +1017,7 @@
           <w:p>
             <w:pPr/>
             <w:r>
-              <w:t>Net-worth goals and target days: Comfortable $1,000 by day 8, Wealthy $5,000 by day 12, Tycoon $10,000 by day 15. Reaching one by its day adds a score bonus.</w:t>
+              <w:t>Net-worth goals and target days: Comfortable $1,000 by day 10, Wealthy $5,000 by day 16, Tycoon $10,000 by day 20. Reaching one by its day adds a score bonus.</w:t>
             </w:r>
           </w:p>
         </w:tc>
@@ -1330,7 +1330,7 @@
           <w:p>
             <w:pPr/>
             <w:r>
-              <w:t xml:space="preserve">15</w:t>
+              <w:t xml:space="preserve">20</w:t>
             </w:r>
           </w:p>
         </w:tc>
@@ -1790,7 +1790,7 @@
           <w:p>
             <w:pPr/>
             <w:r>
-              <w:t xml:space="preserve">8, 12, 15</w:t>
+              <w:t xml:space="preserve">10, 16, 20</w:t>
             </w:r>
           </w:p>
         </w:tc>
@@ -1917,7 +1917,7 @@
           <w:p>
             <w:pPr/>
             <w:r>
-              <w:t>events: storyline, fromDay and toDay</w:t>
+              <w:t>events: storyline, fromDay and daysBeforeEnd</w:t>
             </w:r>
           </w:p>
         </w:tc>
@@ -1928,7 +1928,7 @@
           <w:p>
             <w:pPr/>
             <w:r>
-              <w:t>2 and 8</w:t>
+              <w:t>3 and 3</w:t>
             </w:r>
           </w:p>
         </w:tc>
@@ -1939,7 +1939,7 @@
           <w:p>
             <w:pPr/>
             <w:r>
-              <w:t>The storyline starts on a random evening between these days. Every game has one.</w:t>
+              <w:t>The storyline starts on a random evening from day fromDay to daysBeforeEnd days before the game ends (day 3 to 17 in a 20-day game). Every game has exactly one.</w:t>
             </w:r>
           </w:p>
         </w:tc>
@@ -1952,7 +1952,7 @@
           <w:p>
             <w:pPr/>
             <w:r>
-              <w:t>Allow more than one storyline</w:t>
+              <w:t>Keep the storyline and macro shocks apart</w:t>
             </w:r>
           </w:p>
         </w:tc>
@@ -1963,7 +1963,7 @@
           <w:p>
             <w:pPr/>
             <w:r>
-              <w:t>events: storyline, gapDays</w:t>
+              <w:t>events: storylineGap</w:t>
             </w:r>
           </w:p>
         </w:tc>
@@ -1974,7 +1974,7 @@
           <w:p>
             <w:pPr/>
             <w:r>
-              <w:t>15</w:t>
+              <w:t>2</w:t>
             </w:r>
           </w:p>
         </w:tc>
@@ -1985,7 +1985,7 @@
           <w:p>
             <w:pPr/>
             <w:r>
-              <w:t>Days after a storyline ends before another can start. With 15-day games, 15 means one a game.</w:t>
+              <w:t>Clear days between the storyline and a macro shock, before and after it.</w:t>
             </w:r>
           </w:p>
         </w:tc>
@@ -3720,7 +3720,7 @@
     <w:p>
       <w:pPr/>
       <w:r>
-        <w:t xml:space="preserve">As of 24 October 2026, MASTER CONFIG starts around line 713 and ends around line 1342 of DailyGrind\index.html. Use Ctrl+F to search for a part name, such as </w:t>
+        <w:t xml:space="preserve">As of 24 October 2026, MASTER CONFIG starts around line 737 and ends around line 1357 of DailyGrind\index.html. Use Ctrl+F to search for a part name, such as </w:t>
       </w:r>
       <w:r>
         <w:rPr>
@@ -3758,7 +3758,7 @@
     <w:p>
       <w:pPr/>
       <w:r>
-        <w:t>The three difficulty levels are set in a small table in the code, just below MASTER CONFIG (around line 1408 of index.html). They are not in MASTER CONFIG, so edit them there.</w:t>
+        <w:t>The three difficulty levels are set in a small table in the code, just below MASTER CONFIG (around line 1426 of index.html). They are not in MASTER CONFIG, so edit them there.</w:t>
       </w:r>
     </w:p>
     <w:tbl>

</xml_diff>

<commit_message>
Industry-specific storylines: ten job-market shocks, one a game
- New INDUSTRY table and CONFIG.industry: one industry-specific storyline
  a game (day 3-17, 5-6 nights) on top of the global storyline. Each
  moves pay for chosen roles by a 20-50% swing, freezes or opens hiring,
  and can lay off or suspend the player.
- Employment Office: Industry outlook card (rumour the day before, then
  today's effects); job board and shift rows show the same chips.
- Global storyline cards tagged 🌐, industry cards 🏭; macro shocks keep
  storylineGap from both. New Rules line generated from CONFIG.
- Old saves get a storyline if their window has not passed.
- UI check: three new situations. sim.js: random bot cancels the
  preview by clicking outside it.
- CHANGELOG 73, Config Guide, CODE_MAP, CLAUDE.md, sim report in docs.

Co-Authored-By: Claude Opus 5.5 <noreply@anthropic.com>
Claude-Session: https://claude.ai/code/session_01X4PpPPtrsCd6ZJRCWRgVNF
</commit_message>
<xml_diff>
--- a/docs/Daily Grind Config Guide.docx
+++ b/docs/Daily Grind Config Guide.docx
@@ -877,7 +877,7 @@
           <w:p>
             <w:pPr/>
             <w:r>
-              <w:t>Which event happens each night: one storyline a game (start window and its gap from macro shocks), the chance of a macro shock, the daily event odds, and how often a news headline is tipped off that morning</w:t>
+              <w:t>Which event happens each night: one global storyline a game (start window and its gap from macro shocks), the chance of a macro shock, the daily event odds, and how often a news headline is tipped off that morning</w:t>
             </w:r>
           </w:p>
         </w:tc>
@@ -889,6 +889,41 @@
             <w:pPr/>
             <w:r>
               <w:t>storyline: fromDay:3, daysBeforeEnd:3; storylineGap:2</w:t>
+            </w:r>
+          </w:p>
+        </w:tc>
+      </w:tr>
+      <w:tr>
+        <w:tc>
+          <w:tcPr>
+            <w:tcW w:w="1225" w:type="dxa"/>
+          </w:tcPr>
+          <w:p>
+            <w:pPr/>
+            <w:r>
+              <w:t xml:space="preserve">industry</w:t>
+            </w:r>
+          </w:p>
+        </w:tc>
+        <w:tc>
+          <w:tcPr>
+            <w:tcW w:w="4920" w:type="dxa"/>
+          </w:tcPr>
+          <w:p>
+            <w:pPr/>
+            <w:r>
+              <w:t xml:space="preserve">Industry-specific storylines: one a game on top of the global storyline, hitting particular jobs. Its start window, length, pay swing, layoff and suspension chances, hiring freezes and the Employment Office rumour.</w:t>
+            </w:r>
+          </w:p>
+        </w:tc>
+        <w:tc>
+          <w:tcPr>
+            <w:tcW w:w="3215" w:type="dxa"/>
+          </w:tcPr>
+          <w:p>
+            <w:pPr/>
+            <w:r>
+              <w:t xml:space="preserve">fromDay:3, daysBeforeEnd:3, days:[5,6], paySwing:[0.2,0.5]</w:t>
             </w:r>
           </w:p>
         </w:tc>
@@ -1952,7 +1987,7 @@
           <w:p>
             <w:pPr/>
             <w:r>
-              <w:t>Keep the storyline and macro shocks apart</w:t>
+              <w:t>Keep the storylines and macro shocks apart</w:t>
             </w:r>
           </w:p>
         </w:tc>
@@ -1985,7 +2020,329 @@
           <w:p>
             <w:pPr/>
             <w:r>
-              <w:t>Clear days between the storyline and a macro shock, before and after it.</w:t>
+              <w:t>Clear days between a macro shock and either storyline (global or industry-specific), before and after it.</w:t>
+            </w:r>
+          </w:p>
+        </w:tc>
+      </w:tr>
+      <w:tr>
+        <w:tc>
+          <w:tcPr>
+            <w:tcW w:w="2175" w:type="dxa"/>
+          </w:tcPr>
+          <w:p>
+            <w:pPr/>
+            <w:r>
+              <w:t xml:space="preserve">Change when the industry-specific storyline starts</w:t>
+            </w:r>
+          </w:p>
+        </w:tc>
+        <w:tc>
+          <w:tcPr>
+            <w:tcW w:w="1864" w:type="dxa"/>
+          </w:tcPr>
+          <w:p>
+            <w:pPr/>
+            <w:r>
+              <w:t xml:space="preserve">industry: fromDay and daysBeforeEnd</w:t>
+            </w:r>
+          </w:p>
+        </w:tc>
+        <w:tc>
+          <w:tcPr>
+            <w:tcW w:w="1621" w:type="dxa"/>
+          </w:tcPr>
+          <w:p>
+            <w:pPr/>
+            <w:r>
+              <w:t xml:space="preserve">3 and 3</w:t>
+            </w:r>
+          </w:p>
+        </w:tc>
+        <w:tc>
+          <w:tcPr>
+            <w:tcW w:w="3700" w:type="dxa"/>
+          </w:tcPr>
+          <w:p>
+            <w:pPr/>
+            <w:r>
+              <w:t xml:space="preserve">It starts on a random evening from day fromDay to daysBeforeEnd days before the game ends (day 3 to 17 in a 20-day game), picked separately from the global storyline.</w:t>
+            </w:r>
+          </w:p>
+        </w:tc>
+      </w:tr>
+      <w:tr>
+        <w:tc>
+          <w:tcPr>
+            <w:tcW w:w="2175" w:type="dxa"/>
+          </w:tcPr>
+          <w:p>
+            <w:pPr/>
+            <w:r>
+              <w:t xml:space="preserve">Make industry-specific storylines longer or shorter</w:t>
+            </w:r>
+          </w:p>
+        </w:tc>
+        <w:tc>
+          <w:tcPr>
+            <w:tcW w:w="1864" w:type="dxa"/>
+          </w:tcPr>
+          <w:p>
+            <w:pPr/>
+            <w:r>
+              <w:t xml:space="preserve">industry: days</w:t>
+            </w:r>
+          </w:p>
+        </w:tc>
+        <w:tc>
+          <w:tcPr>
+            <w:tcW w:w="1621" w:type="dxa"/>
+          </w:tcPr>
+          <w:p>
+            <w:pPr/>
+            <w:r>
+              <w:t xml:space="preserve">[5, 6]</w:t>
+            </w:r>
+          </w:p>
+        </w:tc>
+        <w:tc>
+          <w:tcPr>
+            <w:tcW w:w="3700" w:type="dxa"/>
+          </w:tcPr>
+          <w:p>
+            <w:pPr/>
+            <w:r>
+              <w:t xml:space="preserve">How many nights it runs, over its four phases.</w:t>
+            </w:r>
+          </w:p>
+        </w:tc>
+      </w:tr>
+      <w:tr>
+        <w:tc>
+          <w:tcPr>
+            <w:tcW w:w="2175" w:type="dxa"/>
+          </w:tcPr>
+          <w:p>
+            <w:pPr/>
+            <w:r>
+              <w:t xml:space="preserve">Make job pay swing more or less</w:t>
+            </w:r>
+          </w:p>
+        </w:tc>
+        <w:tc>
+          <w:tcPr>
+            <w:tcW w:w="1864" w:type="dxa"/>
+          </w:tcPr>
+          <w:p>
+            <w:pPr/>
+            <w:r>
+              <w:t xml:space="preserve">industry: paySwing</w:t>
+            </w:r>
+          </w:p>
+        </w:tc>
+        <w:tc>
+          <w:tcPr>
+            <w:tcW w:w="1621" w:type="dxa"/>
+          </w:tcPr>
+          <w:p>
+            <w:pPr/>
+            <w:r>
+              <w:t xml:space="preserve">[0.2, 0.5]</w:t>
+            </w:r>
+          </w:p>
+        </w:tc>
+        <w:tc>
+          <w:tcPr>
+            <w:tcW w:w="3700" w:type="dxa"/>
+          </w:tcPr>
+          <w:p>
+            <w:pPr/>
+            <w:r>
+              <w:t xml:space="preserve">Each game rolls one swing in this range (0.2 = 20%). Each phase moves its roles by the full swing or half of it, up or down.</w:t>
+            </w:r>
+          </w:p>
+        </w:tc>
+      </w:tr>
+      <w:tr>
+        <w:tc>
+          <w:tcPr>
+            <w:tcW w:w="2175" w:type="dxa"/>
+          </w:tcPr>
+          <w:p>
+            <w:pPr/>
+            <w:r>
+              <w:t xml:space="preserve">Make industry layoffs more or less likely</w:t>
+            </w:r>
+          </w:p>
+        </w:tc>
+        <w:tc>
+          <w:tcPr>
+            <w:tcW w:w="1864" w:type="dxa"/>
+          </w:tcPr>
+          <w:p>
+            <w:pPr/>
+            <w:r>
+              <w:t xml:space="preserve">industry: layoffChance</w:t>
+            </w:r>
+          </w:p>
+        </w:tc>
+        <w:tc>
+          <w:tcPr>
+            <w:tcW w:w="1621" w:type="dxa"/>
+          </w:tcPr>
+          <w:p>
+            <w:pPr/>
+            <w:r>
+              <w:t xml:space="preserve">0.06</w:t>
+            </w:r>
+          </w:p>
+        </w:tc>
+        <w:tc>
+          <w:tcPr>
+            <w:tcW w:w="3700" w:type="dxa"/>
+          </w:tcPr>
+          <w:p>
+            <w:pPr/>
+            <w:r>
+              <w:t xml:space="preserve">The nightly chance you lose your job (for good) while it is hit by cuts.</w:t>
+            </w:r>
+          </w:p>
+        </w:tc>
+      </w:tr>
+      <w:tr>
+        <w:tc>
+          <w:tcPr>
+            <w:tcW w:w="2175" w:type="dxa"/>
+          </w:tcPr>
+          <w:p>
+            <w:pPr/>
+            <w:r>
+              <w:t xml:space="preserve">Make industry suspensions more or less likely</w:t>
+            </w:r>
+          </w:p>
+        </w:tc>
+        <w:tc>
+          <w:tcPr>
+            <w:tcW w:w="1864" w:type="dxa"/>
+          </w:tcPr>
+          <w:p>
+            <w:pPr/>
+            <w:r>
+              <w:t xml:space="preserve">industry: suspendChance and suspendDays</w:t>
+            </w:r>
+          </w:p>
+        </w:tc>
+        <w:tc>
+          <w:tcPr>
+            <w:tcW w:w="1621" w:type="dxa"/>
+          </w:tcPr>
+          <w:p>
+            <w:pPr/>
+            <w:r>
+              <w:t xml:space="preserve">0.15 and [1, 3]</w:t>
+            </w:r>
+          </w:p>
+        </w:tc>
+        <w:tc>
+          <w:tcPr>
+            <w:tcW w:w="3700" w:type="dxa"/>
+          </w:tcPr>
+          <w:p>
+            <w:pPr/>
+            <w:r>
+              <w:t xml:space="preserve">If you are not laid off, the nightly chance your workplace suspends work, and for how many days. Your job is kept.</w:t>
+            </w:r>
+          </w:p>
+        </w:tc>
+      </w:tr>
+      <w:tr>
+        <w:tc>
+          <w:tcPr>
+            <w:tcW w:w="2175" w:type="dxa"/>
+          </w:tcPr>
+          <w:p>
+            <w:pPr/>
+            <w:r>
+              <w:t xml:space="preserve">Make hiring freezes stricter</w:t>
+            </w:r>
+          </w:p>
+        </w:tc>
+        <w:tc>
+          <w:tcPr>
+            <w:tcW w:w="1864" w:type="dxa"/>
+          </w:tcPr>
+          <w:p>
+            <w:pPr/>
+            <w:r>
+              <w:t xml:space="preserve">industry: freezeShare</w:t>
+            </w:r>
+          </w:p>
+        </w:tc>
+        <w:tc>
+          <w:tcPr>
+            <w:tcW w:w="1621" w:type="dxa"/>
+          </w:tcPr>
+          <w:p>
+            <w:pPr/>
+            <w:r>
+              <w:t xml:space="preserve">0.8</w:t>
+            </w:r>
+          </w:p>
+        </w:tc>
+        <w:tc>
+          <w:tcPr>
+            <w:tcW w:w="3700" w:type="dxa"/>
+          </w:tcPr>
+          <w:p>
+            <w:pPr/>
+            <w:r>
+              <w:t xml:space="preserve">In a hiring freeze, the chance each affected role has no openings that day (normally 0.25).</w:t>
+            </w:r>
+          </w:p>
+        </w:tc>
+      </w:tr>
+      <w:tr>
+        <w:tc>
+          <w:tcPr>
+            <w:tcW w:w="2175" w:type="dxa"/>
+          </w:tcPr>
+          <w:p>
+            <w:pPr/>
+            <w:r>
+              <w:t xml:space="preserve">Give more warning</w:t>
+            </w:r>
+          </w:p>
+        </w:tc>
+        <w:tc>
+          <w:tcPr>
+            <w:tcW w:w="1864" w:type="dxa"/>
+          </w:tcPr>
+          <w:p>
+            <w:pPr/>
+            <w:r>
+              <w:t xml:space="preserve">industry: rumourDays</w:t>
+            </w:r>
+          </w:p>
+        </w:tc>
+        <w:tc>
+          <w:tcPr>
+            <w:tcW w:w="1621" w:type="dxa"/>
+          </w:tcPr>
+          <w:p>
+            <w:pPr/>
+            <w:r>
+              <w:t xml:space="preserve">1</w:t>
+            </w:r>
+          </w:p>
+        </w:tc>
+        <w:tc>
+          <w:tcPr>
+            <w:tcW w:w="3700" w:type="dxa"/>
+          </w:tcPr>
+          <w:p>
+            <w:pPr/>
+            <w:r>
+              <w:t xml:space="preserve">How many days before it starts the Employment Office shows a rumour. 0 = only on the day itself.</w:t>
             </w:r>
           </w:p>
         </w:tc>
@@ -3720,7 +4077,7 @@
     <w:p>
       <w:pPr/>
       <w:r>
-        <w:t xml:space="preserve">As of 24 October 2026, MASTER CONFIG starts around line 737 and ends around line 1357 of DailyGrind\index.html. Use Ctrl+F to search for a part name, such as </w:t>
+        <w:t xml:space="preserve">As of 24 October 2026, MASTER CONFIG starts around line 738 and ends around line 1368 of DailyGrind\index.html. Use Ctrl+F to search for a part name, such as </w:t>
       </w:r>
       <w:r>
         <w:rPr>
@@ -3758,7 +4115,7 @@
     <w:p>
       <w:pPr/>
       <w:r>
-        <w:t>The three difficulty levels are set in a small table in the code, just below MASTER CONFIG (around line 1426 of index.html). They are not in MASTER CONFIG, so edit them there.</w:t>
+        <w:t>The three difficulty levels are set in a small table in the code, just below MASTER CONFIG (around line 1437 of index.html). They are not in MASTER CONFIG, so edit them there.</w:t>
       </w:r>
     </w:p>
     <w:tbl>

</xml_diff>

<commit_message>
Used clothes at the Thrift Store; no clothes means no work and morning shame
- Thrift Store: used Smart Casual and Business Suit at 30% of the Mall
  price, lasting 3 days (CONFIG.clothes.used).
- With no clothes at all, every shift away from home and Factory day
  labour is blocked until you buy some; freelance at home still works.
- Each morning with no clothes costs 5 happiness
  (CONFIG.shame.noClothesHappiness) and the morning pop-up says so.
- Rules "Shame" line, CHANGELOG 74, Config Guide, two UI check situations.

Co-Authored-By: Claude Opus 5.5 <noreply@anthropic.com>
Claude-Session: https://claude.ai/code/session_01X4PpPPtrsCd6ZJRCWRgVNF
</commit_message>
<xml_diff>
--- a/docs/Daily Grind Config Guide.docx
+++ b/docs/Daily Grind Config Guide.docx
@@ -387,7 +387,7 @@
           <w:p>
             <w:pPr/>
             <w:r>
-              <w:t xml:space="preserve">Outfit prices, how long each one lasts, haggling</w:t>
+              <w:t xml:space="preserve">Outfit prices, how long each one lasts, haggling, used outfits at the Thrift Store</w:t>
             </w:r>
           </w:p>
         </w:tc>
@@ -1573,6 +1573,52 @@
           <w:p>
             <w:pPr/>
             <w:r>
+              <w:t xml:space="preserve">Change used clothes at the Thrift Store</w:t>
+            </w:r>
+          </w:p>
+        </w:tc>
+        <w:tc>
+          <w:tcPr>
+            <w:tcW w:w="1864" w:type="dxa"/>
+          </w:tcPr>
+          <w:p>
+            <w:pPr/>
+            <w:r>
+              <w:t xml:space="preserve">clothes: used, priceShare and days</w:t>
+            </w:r>
+          </w:p>
+        </w:tc>
+        <w:tc>
+          <w:tcPr>
+            <w:tcW w:w="1621" w:type="dxa"/>
+          </w:tcPr>
+          <w:p>
+            <w:pPr/>
+            <w:r>
+              <w:t xml:space="preserve">0.3 and 3</w:t>
+            </w:r>
+          </w:p>
+        </w:tc>
+        <w:tc>
+          <w:tcPr>
+            <w:tcW w:w="3700" w:type="dxa"/>
+          </w:tcPr>
+          <w:p>
+            <w:pPr/>
+            <w:r>
+              <w:t xml:space="preserve">Used Smart Casual and Business Suits cost priceShare of the Clothes Mall price (before the price index) and last this many days.</w:t>
+            </w:r>
+          </w:p>
+        </w:tc>
+      </w:tr>
+      <w:tr>
+        <w:tc>
+          <w:tcPr>
+            <w:tcW w:w="2175" w:type="dxa"/>
+          </w:tcPr>
+          <w:p>
+            <w:pPr/>
+            <w:r>
               <w:t xml:space="preserve">Make meal prep cheaper</w:t>
             </w:r>
           </w:p>
@@ -3321,7 +3367,7 @@
           <w:p>
             <w:pPr/>
             <w:r>
-              <w:t>Change money shame</w:t>
+              <w:t>Change shame</w:t>
             </w:r>
           </w:p>
         </w:tc>
@@ -3355,6 +3401,52 @@
             <w:pPr/>
             <w:r>
               <w:t>Checked when you end the day. Nearly broke (net worth under nearlyBrokeBelow) costs nearlyBrokeHappiness, only from day nearlyBrokeFromDay. In debt (under 0) costs debtHappiness and debtEnergy from day 1.</w:t>
+            </w:r>
+          </w:p>
+        </w:tc>
+      </w:tr>
+      <w:tr>
+        <w:tc>
+          <w:tcPr>
+            <w:tcW w:w="2175" w:type="dxa"/>
+          </w:tcPr>
+          <w:p>
+            <w:pPr/>
+            <w:r>
+              <w:t xml:space="preserve">Change the shame of having no clothes</w:t>
+            </w:r>
+          </w:p>
+        </w:tc>
+        <w:tc>
+          <w:tcPr>
+            <w:tcW w:w="1864" w:type="dxa"/>
+          </w:tcPr>
+          <w:p>
+            <w:pPr/>
+            <w:r>
+              <w:t xml:space="preserve">shame: noClothesHappiness</w:t>
+            </w:r>
+          </w:p>
+        </w:tc>
+        <w:tc>
+          <w:tcPr>
+            <w:tcW w:w="1621" w:type="dxa"/>
+          </w:tcPr>
+          <w:p>
+            <w:pPr/>
+            <w:r>
+              <w:t xml:space="preserve">−5</w:t>
+            </w:r>
+          </w:p>
+        </w:tc>
+        <w:tc>
+          <w:tcPr>
+            <w:tcW w:w="3700" w:type="dxa"/>
+          </w:tcPr>
+          <w:p>
+            <w:pPr/>
+            <w:r>
+              <w:t xml:space="preserve">Happiness each morning you wake up owning no clothes at all. While you have none you also can’t work any shift away from home.</w:t>
             </w:r>
           </w:p>
         </w:tc>
@@ -4077,7 +4169,7 @@
     <w:p>
       <w:pPr/>
       <w:r>
-        <w:t xml:space="preserve">As of 24 October 2026, MASTER CONFIG starts around line 738 and ends around line 1368 of DailyGrind\index.html. Use Ctrl+F to search for a part name, such as </w:t>
+        <w:t xml:space="preserve">As of 24 October 2026, MASTER CONFIG starts around line 738 and ends around line 1372 of DailyGrind\index.html. Use Ctrl+F to search for a part name, such as </w:t>
       </w:r>
       <w:r>
         <w:rPr>
@@ -4115,7 +4207,7 @@
     <w:p>
       <w:pPr/>
       <w:r>
-        <w:t>The three difficulty levels are set in a small table in the code, just below MASTER CONFIG (around line 1437 of index.html). They are not in MASTER CONFIG, so edit them there.</w:t>
+        <w:t>The three difficulty levels are set in a small table in the code, just below MASTER CONFIG (around line 1441 of index.html). They are not in MASTER CONFIG, so edit them there.</w:t>
       </w:r>
     </w:p>
     <w:tbl>

</xml_diff>

<commit_message>
Bank worth using: higher returns, Bank app, morning money briefing, one-day offers
- Savings about 2% a day (rateBase 1 -> 2, new games start there); fixed
  deposit 1.25x savings; ETF/hedge fund/crypto expect about 2/3/4% a day.
  Return numbers moved into CONFIG.market.returns.
- 📱 Bank app on the Overview: savings, investments and offers from
  anywhere with a phone, tablet or computer; loans still need a visit.
- Morning briefing: what your money made overnight, today's rates and
  the best return open to you.
- One-day promo deposit offers (CONFIG.bank.offers): 3-3.5% a day for
  3 days, $300-$1,000, paid into cash at maturity.
- Rules Bank line, CHANGELOG 75, Config Guide, CODE_MAP, 3 UI check
  situations.

Co-Authored-By: Claude Opus 5.5 <noreply@anthropic.com>
Claude-Session: https://claude.ai/code/session_01X4PpPPtrsCd6ZJRCWRgVNF
</commit_message>
<xml_diff>
--- a/docs/Daily Grind Config Guide.docx
+++ b/docs/Daily Grind Config Guide.docx
@@ -282,7 +282,7 @@
           <w:p>
             <w:pPr/>
             <w:r>
-              <w:t xml:space="preserve">How investments (ETF, hedge fund, crypto) react to the economy</w:t>
+              <w:t xml:space="preserve">How savings and investments pay and react to the economy: the normal savings rate, each product's expected return, and how market mood moves</w:t>
             </w:r>
           </w:p>
         </w:tc>
@@ -293,7 +293,42 @@
           <w:p>
             <w:pPr/>
             <w:r>
-              <w:t xml:space="preserve">rateHit:1.5</w:t>
+              <w:t xml:space="preserve">rateBase:2</w:t>
+            </w:r>
+          </w:p>
+        </w:tc>
+      </w:tr>
+      <w:tr>
+        <w:tc>
+          <w:tcPr>
+            <w:tcW w:w="1225" w:type="dxa"/>
+          </w:tcPr>
+          <w:p>
+            <w:pPr/>
+            <w:r>
+              <w:t xml:space="preserve">bank</w:t>
+            </w:r>
+          </w:p>
+        </w:tc>
+        <w:tc>
+          <w:tcPr>
+            <w:tcW w:w="4920" w:type="dxa"/>
+          </w:tcPr>
+          <w:p>
+            <w:pPr/>
+            <w:r>
+              <w:t xml:space="preserve">One-day promo deposit offers at the Bank: how often, from which day, rate, length and amounts</w:t>
+            </w:r>
+          </w:p>
+        </w:tc>
+        <w:tc>
+          <w:tcPr>
+            <w:tcW w:w="3215" w:type="dxa"/>
+          </w:tcPr>
+          <w:p>
+            <w:pPr/>
+            <w:r>
+              <w:t xml:space="preserve">offers: chance:0.15</w:t>
             </w:r>
           </w:p>
         </w:tc>
@@ -1619,6 +1654,144 @@
           <w:p>
             <w:pPr/>
             <w:r>
+              <w:t xml:space="preserve">Make savings pay more or less</w:t>
+            </w:r>
+          </w:p>
+        </w:tc>
+        <w:tc>
+          <w:tcPr>
+            <w:tcW w:w="1864" w:type="dxa"/>
+          </w:tcPr>
+          <w:p>
+            <w:pPr/>
+            <w:r>
+              <w:t xml:space="preserve">market: rateBase</w:t>
+            </w:r>
+          </w:p>
+        </w:tc>
+        <w:tc>
+          <w:tcPr>
+            <w:tcW w:w="1621" w:type="dxa"/>
+          </w:tcPr>
+          <w:p>
+            <w:pPr/>
+            <w:r>
+              <w:t xml:space="preserve">2</w:t>
+            </w:r>
+          </w:p>
+        </w:tc>
+        <w:tc>
+          <w:tcPr>
+            <w:tcW w:w="3700" w:type="dxa"/>
+          </w:tcPr>
+          <w:p>
+            <w:pPr/>
+            <w:r>
+              <w:t xml:space="preserve">The normal savings rate (% a day). Interest drifts back to it after news moves it. The fixed deposit pays this × returns.fdOverSavings.</w:t>
+            </w:r>
+          </w:p>
+        </w:tc>
+      </w:tr>
+      <w:tr>
+        <w:tc>
+          <w:tcPr>
+            <w:tcW w:w="2175" w:type="dxa"/>
+          </w:tcPr>
+          <w:p>
+            <w:pPr/>
+            <w:r>
+              <w:t xml:space="preserve">Change investment returns</w:t>
+            </w:r>
+          </w:p>
+        </w:tc>
+        <w:tc>
+          <w:tcPr>
+            <w:tcW w:w="1864" w:type="dxa"/>
+          </w:tcPr>
+          <w:p>
+            <w:pPr/>
+            <w:r>
+              <w:t xml:space="preserve">market: returns</w:t>
+            </w:r>
+          </w:p>
+        </w:tc>
+        <w:tc>
+          <w:tcPr>
+            <w:tcW w:w="1621" w:type="dxa"/>
+          </w:tcPr>
+          <w:p>
+            <w:pPr/>
+            <w:r>
+              <w:t xml:space="preserve">fdOverSavings 1.25; etf 2 / 0.8; hf 3 / 1.6; cry 4 / 3</w:t>
+            </w:r>
+          </w:p>
+        </w:tc>
+        <w:tc>
+          <w:tcPr>
+            <w:tcW w:w="3700" w:type="dxa"/>
+          </w:tcPr>
+          <w:p>
+            <w:pPr/>
+            <w:r>
+              <w:t xml:space="preserve">Expected daily return (%) = base + mood × market mood for the ETF, hedge fund and crypto; the fixed deposit pays the savings rate × fdOverSavings. Daily swings are set in the code (VOL).</w:t>
+            </w:r>
+          </w:p>
+        </w:tc>
+      </w:tr>
+      <w:tr>
+        <w:tc>
+          <w:tcPr>
+            <w:tcW w:w="2175" w:type="dxa"/>
+          </w:tcPr>
+          <w:p>
+            <w:pPr/>
+            <w:r>
+              <w:t xml:space="preserve">Change bank offers</w:t>
+            </w:r>
+          </w:p>
+        </w:tc>
+        <w:tc>
+          <w:tcPr>
+            <w:tcW w:w="1864" w:type="dxa"/>
+          </w:tcPr>
+          <w:p>
+            <w:pPr/>
+            <w:r>
+              <w:t xml:space="preserve">bank: offers</w:t>
+            </w:r>
+          </w:p>
+        </w:tc>
+        <w:tc>
+          <w:tcPr>
+            <w:tcW w:w="1621" w:type="dxa"/>
+          </w:tcPr>
+          <w:p>
+            <w:pPr/>
+            <w:r>
+              <w:t xml:space="preserve">chance 0.15, fromDay 3, rate [3, 3.5], days 3, min 300, max 1000</w:t>
+            </w:r>
+          </w:p>
+        </w:tc>
+        <w:tc>
+          <w:tcPr>
+            <w:tcW w:w="3700" w:type="dxa"/>
+          </w:tcPr>
+          <w:p>
+            <w:pPr/>
+            <w:r>
+              <w:t xml:space="preserve">Each morning from fromDay, the chance of a one-day promo deposit offer, its rate range (% a day), how many days it is locked, and the amounts allowed. 0 chance turns offers off. Keep the rate below the cheapest loan.</w:t>
+            </w:r>
+          </w:p>
+        </w:tc>
+      </w:tr>
+      <w:tr>
+        <w:tc>
+          <w:tcPr>
+            <w:tcW w:w="2175" w:type="dxa"/>
+          </w:tcPr>
+          <w:p>
+            <w:pPr/>
+            <w:r>
               <w:t xml:space="preserve">Make meal prep cheaper</w:t>
             </w:r>
           </w:p>
@@ -4169,7 +4342,7 @@
     <w:p>
       <w:pPr/>
       <w:r>
-        <w:t xml:space="preserve">As of 24 October 2026, MASTER CONFIG starts around line 738 and ends around line 1372 of DailyGrind\index.html. Use Ctrl+F to search for a part name, such as </w:t>
+        <w:t xml:space="preserve">As of 24 October 2026, MASTER CONFIG starts around line 740 and ends around line 1384 of DailyGrind\index.html. Use Ctrl+F to search for a part name, such as </w:t>
       </w:r>
       <w:r>
         <w:rPr>
@@ -4207,7 +4380,7 @@
     <w:p>
       <w:pPr/>
       <w:r>
-        <w:t>The three difficulty levels are set in a small table in the code, just below MASTER CONFIG (around line 1441 of index.html). They are not in MASTER CONFIG, so edit them there.</w:t>
+        <w:t>The three difficulty levels are set in a small table in the code, just below MASTER CONFIG (around line 1453 of index.html). They are not in MASTER CONFIG, so edit them there.</w:t>
       </w:r>
     </w:p>
     <w:tbl>

</xml_diff>

<commit_message>
Community Centre; the Pawn Shop becomes the Thrift Store's pawn counter
- New Community Centre on the Pawn Shop's map spot: night out, karaoke
  and volunteering, once a day each (CONFIG.community). A night out or
  volunteering can bring a friend's job tip: the next interview is
  easier and skips "no openings".
- Pawning and redeeming move to a Sell & pawn card at the Thrift Store;
  the pawn counter and back office jobs move there too (same career
  keys). Old saves carry over (closure, work experience, location).
- Rules line, CHANGELOG 77, Config Guide, CODE_MAP, UI check situations,
  simulation report in docs.

Co-Authored-By: Claude Opus 5.5 <noreply@anthropic.com>
Claude-Session: https://claude.ai/code/session_01X4PpPPtrsCd6ZJRCWRgVNF
</commit_message>
<xml_diff>
--- a/docs/Daily Grind Config Guide.docx
+++ b/docs/Daily Grind Config Guide.docx
@@ -784,6 +784,41 @@
             <w:pPr/>
             <w:r>
               <w:t xml:space="preserve">ticketCost:10</w:t>
+            </w:r>
+          </w:p>
+        </w:tc>
+      </w:tr>
+      <w:tr>
+        <w:tc>
+          <w:tcPr>
+            <w:tcW w:w="1225" w:type="dxa"/>
+          </w:tcPr>
+          <w:p>
+            <w:pPr/>
+            <w:r>
+              <w:t xml:space="preserve">community</w:t>
+            </w:r>
+          </w:p>
+        </w:tc>
+        <w:tc>
+          <w:tcPr>
+            <w:tcW w:w="4920" w:type="dxa"/>
+          </w:tcPr>
+          <w:p>
+            <w:pPr/>
+            <w:r>
+              <w:t xml:space="preserve">Community Centre activities (night out, karaoke, volunteering) and the friend’s job tip they can give</w:t>
+            </w:r>
+          </w:p>
+        </w:tc>
+        <w:tc>
+          <w:tcPr>
+            <w:tcW w:w="3215" w:type="dxa"/>
+          </w:tcPr>
+          <w:p>
+            <w:pPr/>
+            <w:r>
+              <w:t xml:space="preserve">nightOut: cost:25, happiness:15</w:t>
             </w:r>
           </w:p>
         </w:tc>
@@ -3448,6 +3483,98 @@
           <w:p>
             <w:pPr/>
             <w:r>
+              <w:t xml:space="preserve">Change the Community Centre activities</w:t>
+            </w:r>
+          </w:p>
+        </w:tc>
+        <w:tc>
+          <w:tcPr>
+            <w:tcW w:w="1864" w:type="dxa"/>
+          </w:tcPr>
+          <w:p>
+            <w:pPr/>
+            <w:r>
+              <w:t xml:space="preserve">community: nightOut, karaoke, volunteer</w:t>
+            </w:r>
+          </w:p>
+        </w:tc>
+        <w:tc>
+          <w:tcPr>
+            <w:tcW w:w="1621" w:type="dxa"/>
+          </w:tcPr>
+          <w:p>
+            <w:pPr/>
+            <w:r>
+              <w:t xml:space="preserve">see right</w:t>
+            </w:r>
+          </w:p>
+        </w:tc>
+        <w:tc>
+          <w:tcPr>
+            <w:tcW w:w="3700" w:type="dxa"/>
+          </w:tcPr>
+          <w:p>
+            <w:pPr/>
+            <w:r>
+              <w:t xml:space="preserve">Each: cost ($, before the price index), minutes, energy, happiness, knowledge, perDay (times a day) and tipChance (the chance of a friend’s job tip).</w:t>
+            </w:r>
+          </w:p>
+        </w:tc>
+      </w:tr>
+      <w:tr>
+        <w:tc>
+          <w:tcPr>
+            <w:tcW w:w="2175" w:type="dxa"/>
+          </w:tcPr>
+          <w:p>
+            <w:pPr/>
+            <w:r>
+              <w:t xml:space="preserve">Change the friend’s job tip</w:t>
+            </w:r>
+          </w:p>
+        </w:tc>
+        <w:tc>
+          <w:tcPr>
+            <w:tcW w:w="1864" w:type="dxa"/>
+          </w:tcPr>
+          <w:p>
+            <w:pPr/>
+            <w:r>
+              <w:t xml:space="preserve">community: tip, days and passBonus</w:t>
+            </w:r>
+          </w:p>
+        </w:tc>
+        <w:tc>
+          <w:tcPr>
+            <w:tcW w:w="1621" w:type="dxa"/>
+          </w:tcPr>
+          <w:p>
+            <w:pPr/>
+            <w:r>
+              <w:t xml:space="preserve">3 and 0.3</w:t>
+            </w:r>
+          </w:p>
+        </w:tc>
+        <w:tc>
+          <w:tcPr>
+            <w:tcW w:w="3700" w:type="dxa"/>
+          </w:tcPr>
+          <w:p>
+            <w:pPr/>
+            <w:r>
+              <w:t xml:space="preserve">How many days a tip lasts (counting today), and how much it adds to the next interview’s pass chance (it also skips “no openings”).</w:t>
+            </w:r>
+          </w:p>
+        </w:tc>
+      </w:tr>
+      <w:tr>
+        <w:tc>
+          <w:tcPr>
+            <w:tcW w:w="2175" w:type="dxa"/>
+          </w:tcPr>
+          <w:p>
+            <w:pPr/>
+            <w:r>
               <w:t>Change coffee and cake</w:t>
             </w:r>
           </w:p>
@@ -4342,7 +4469,7 @@
     <w:p>
       <w:pPr/>
       <w:r>
-        <w:t xml:space="preserve">As of 24 October 2026, MASTER CONFIG starts around line 740 and ends around line 1384 of DailyGrind\index.html. Use Ctrl+F to search for a part name, such as </w:t>
+        <w:t xml:space="preserve">As of 24 October 2026, MASTER CONFIG starts around line 741 and ends around line 1395 of DailyGrind\index.html. Use Ctrl+F to search for a part name, such as </w:t>
       </w:r>
       <w:r>
         <w:rPr>
@@ -4380,7 +4507,7 @@
     <w:p>
       <w:pPr/>
       <w:r>
-        <w:t>The three difficulty levels are set in a small table in the code, just below MASTER CONFIG (around line 1453 of index.html). They are not in MASTER CONFIG, so edit them there.</w:t>
+        <w:t>The three difficulty levels are set in a small table in the code, just below MASTER CONFIG (around line 1464 of index.html). They are not in MASTER CONFIG, so edit them there.</w:t>
       </w:r>
     </w:p>
     <w:tbl>

</xml_diff>

<commit_message>
Rival games: reaching Tycoon is a milestone, the race runs to day 30
- In a game with AI rivals, the top rank shows a milestone and play
  goes on to the last day, where the town standings are taken. Single
  games still end at Tycoon. Rules text updated.
- Config Guide: CONFIG.rivals rows; time.gameDays row notes the rival
  length; the stale gameDays:15 example is now 20.

Co-Authored-By: Claude Opus 5.5 <noreply@anthropic.com>
Claude-Session: https://claude.ai/code/session_01X4PpPPtrsCd6ZJRCWRgVNF
</commit_message>
<xml_diff>
--- a/docs/Daily Grind Config Guide.docx
+++ b/docs/Daily Grind Config Guide.docx
@@ -387,7 +387,7 @@
           <w:p>
             <w:pPr/>
             <w:r>
-              <w:t>Length of the day, walking, rent every 5 days, game length of 20 days, shift length by pay, how long actions take</w:t>
+              <w:t>Length of the day, walking, rent every 5 days, game length of 20 days (30 with AI rivals), shift length by pay, how long actions take</w:t>
             </w:r>
           </w:p>
         </w:tc>
@@ -398,7 +398,7 @@
           <w:p>
             <w:pPr/>
             <w:r>
-              <w:t xml:space="preserve">gameDays:15</w:t>
+              <w:t xml:space="preserve">gameDays:20</w:t>
             </w:r>
           </w:p>
         </w:tc>
@@ -819,6 +819,41 @@
             <w:pPr/>
             <w:r>
               <w:t xml:space="preserve">nightOut: cost:25, happiness:15</w:t>
+            </w:r>
+          </w:p>
+        </w:tc>
+      </w:tr>
+      <w:tr>
+        <w:tc>
+          <w:tcPr>
+            <w:tcW w:w="1225" w:type="dxa"/>
+          </w:tcPr>
+          <w:p>
+            <w:pPr/>
+            <w:r>
+              <w:t xml:space="preserve">rivals</w:t>
+            </w:r>
+          </w:p>
+        </w:tc>
+        <w:tc>
+          <w:tcPr>
+            <w:tcW w:w="4920" w:type="dxa"/>
+          </w:tcPr>
+          <w:p>
+            <w:pPr/>
+            <w:r>
+              <w:t xml:space="preserve">A game with AI rivals: its length, how many industry-specific storylines it has, the rivals’ names, and how easy, medium and expert rivals play</w:t>
+            </w:r>
+          </w:p>
+        </w:tc>
+        <w:tc>
+          <w:tcPr>
+            <w:tcW w:w="3215" w:type="dxa"/>
+          </w:tcPr>
+          <w:p>
+            <w:pPr/>
+            <w:r>
+              <w:t xml:space="preserve">gameDays:30</w:t>
             </w:r>
           </w:p>
         </w:tc>
@@ -1446,7 +1481,7 @@
           <w:p>
             <w:pPr/>
             <w:r>
-              <w:t xml:space="preserve">More days means a longer game.</w:t>
+              <w:t xml:space="preserve">More days means a longer single game. A game with AI rivals uses rivals: gameDays instead. Rank target days stretch with the length.</w:t>
             </w:r>
           </w:p>
         </w:tc>
@@ -3563,6 +3598,236 @@
             <w:pPr/>
             <w:r>
               <w:t xml:space="preserve">How many days a tip lasts (counting today), and how much it adds to the next interview’s pass chance (it also skips “no openings”).</w:t>
+            </w:r>
+          </w:p>
+        </w:tc>
+      </w:tr>
+      <w:tr>
+        <w:tc>
+          <w:tcPr>
+            <w:tcW w:w="2175" w:type="dxa"/>
+          </w:tcPr>
+          <w:p>
+            <w:pPr/>
+            <w:r>
+              <w:t xml:space="preserve">Make a rival game longer or shorter</w:t>
+            </w:r>
+          </w:p>
+        </w:tc>
+        <w:tc>
+          <w:tcPr>
+            <w:tcW w:w="1864" w:type="dxa"/>
+          </w:tcPr>
+          <w:p>
+            <w:pPr/>
+            <w:r>
+              <w:t xml:space="preserve">rivals: gameDays</w:t>
+            </w:r>
+          </w:p>
+        </w:tc>
+        <w:tc>
+          <w:tcPr>
+            <w:tcW w:w="1621" w:type="dxa"/>
+          </w:tcPr>
+          <w:p>
+            <w:pPr/>
+            <w:r>
+              <w:t xml:space="preserve">30</w:t>
+            </w:r>
+          </w:p>
+        </w:tc>
+        <w:tc>
+          <w:tcPr>
+            <w:tcW w:w="3700" w:type="dxa"/>
+          </w:tcPr>
+          <w:p>
+            <w:pPr/>
+            <w:r>
+              <w:t xml:space="preserve">How long a game with AI rivals lasts. Storyline windows and rank target days (15/24/30) follow it. Reaching the top rank does not end a rival game.</w:t>
+            </w:r>
+          </w:p>
+        </w:tc>
+      </w:tr>
+      <w:tr>
+        <w:tc>
+          <w:tcPr>
+            <w:tcW w:w="2175" w:type="dxa"/>
+          </w:tcPr>
+          <w:p>
+            <w:pPr/>
+            <w:r>
+              <w:t xml:space="preserve">Change the industry storylines in a rival game</w:t>
+            </w:r>
+          </w:p>
+        </w:tc>
+        <w:tc>
+          <w:tcPr>
+            <w:tcW w:w="1864" w:type="dxa"/>
+          </w:tcPr>
+          <w:p>
+            <w:pPr/>
+            <w:r>
+              <w:t xml:space="preserve">rivals: industryStorylines and industryGapDays</w:t>
+            </w:r>
+          </w:p>
+        </w:tc>
+        <w:tc>
+          <w:tcPr>
+            <w:tcW w:w="1621" w:type="dxa"/>
+          </w:tcPr>
+          <w:p>
+            <w:pPr/>
+            <w:r>
+              <w:t xml:space="preserve">2 and 5</w:t>
+            </w:r>
+          </w:p>
+        </w:tc>
+        <w:tc>
+          <w:tcPr>
+            <w:tcW w:w="3700" w:type="dxa"/>
+          </w:tcPr>
+          <w:p>
+            <w:pPr/>
+            <w:r>
+              <w:t xml:space="preserve">How many industry-specific storylines a rival game has, and the fewest days between one ending and the next starting.</w:t>
+            </w:r>
+          </w:p>
+        </w:tc>
+      </w:tr>
+      <w:tr>
+        <w:tc>
+          <w:tcPr>
+            <w:tcW w:w="2175" w:type="dxa"/>
+          </w:tcPr>
+          <w:p>
+            <w:pPr/>
+            <w:r>
+              <w:t xml:space="preserve">Make rivals sleep less (busier days)</w:t>
+            </w:r>
+          </w:p>
+        </w:tc>
+        <w:tc>
+          <w:tcPr>
+            <w:tcW w:w="1864" w:type="dxa"/>
+          </w:tcPr>
+          <w:p>
+            <w:pPr/>
+            <w:r>
+              <w:t xml:space="preserve">rivals: dayOverheadMinutes</w:t>
+            </w:r>
+          </w:p>
+        </w:tc>
+        <w:tc>
+          <w:tcPr>
+            <w:tcW w:w="1621" w:type="dxa"/>
+          </w:tcPr>
+          <w:p>
+            <w:pPr/>
+            <w:r>
+              <w:t xml:space="preserve">180</w:t>
+            </w:r>
+          </w:p>
+        </w:tc>
+        <w:tc>
+          <w:tcPr>
+            <w:tcW w:w="3700" w:type="dxa"/>
+          </w:tcPr>
+          <w:p>
+            <w:pPr/>
+            <w:r>
+              <w:t xml:space="preserve">Minutes of each rival’s day spent walking and on errands. More means less sleep, so lower energy and happiness.</w:t>
+            </w:r>
+          </w:p>
+        </w:tc>
+      </w:tr>
+      <w:tr>
+        <w:tc>
+          <w:tcPr>
+            <w:tcW w:w="2175" w:type="dxa"/>
+          </w:tcPr>
+          <w:p>
+            <w:pPr/>
+            <w:r>
+              <w:t xml:space="preserve">Make rivals easier or harder</w:t>
+            </w:r>
+          </w:p>
+        </w:tc>
+        <w:tc>
+          <w:tcPr>
+            <w:tcW w:w="1864" w:type="dxa"/>
+          </w:tcPr>
+          <w:p>
+            <w:pPr/>
+            <w:r>
+              <w:t xml:space="preserve">rivals: levels (easy, medium, expert)</w:t>
+            </w:r>
+          </w:p>
+        </w:tc>
+        <w:tc>
+          <w:tcPr>
+            <w:tcW w:w="1621" w:type="dxa"/>
+          </w:tcPr>
+          <w:p>
+            <w:pPr/>
+            <w:r>
+              <w:t xml:space="preserve">see right</w:t>
+            </w:r>
+          </w:p>
+        </w:tc>
+        <w:tc>
+          <w:tcPr>
+            <w:tcW w:w="3700" w:type="dxa"/>
+          </w:tcPr>
+          <w:p>
+            <w:pPr/>
+            <w:r>
+              <w:t xml:space="preserve">For each level: mistakeChance (a day going wrong), shifts a day, plans (studies for the best reachable job), studyHours and studyChance, applyTries (interviews a day), usesOutlook (judges jobs by today’s pay), bank (none, savings or invest) and moraleAim (happiness it tops up to; social adds the Community Centre).</w:t>
+            </w:r>
+          </w:p>
+        </w:tc>
+      </w:tr>
+      <w:tr>
+        <w:tc>
+          <w:tcPr>
+            <w:tcW w:w="2175" w:type="dxa"/>
+          </w:tcPr>
+          <w:p>
+            <w:pPr/>
+            <w:r>
+              <w:t xml:space="preserve">Rename the rivals</w:t>
+            </w:r>
+          </w:p>
+        </w:tc>
+        <w:tc>
+          <w:tcPr>
+            <w:tcW w:w="1864" w:type="dxa"/>
+          </w:tcPr>
+          <w:p>
+            <w:pPr/>
+            <w:r>
+              <w:t xml:space="preserve">rivals: names and icons</w:t>
+            </w:r>
+          </w:p>
+        </w:tc>
+        <w:tc>
+          <w:tcPr>
+            <w:tcW w:w="1621" w:type="dxa"/>
+          </w:tcPr>
+          <w:p>
+            <w:pPr/>
+            <w:r>
+              <w:t xml:space="preserve">Maya, Leo, Sam</w:t>
+            </w:r>
+          </w:p>
+        </w:tc>
+        <w:tc>
+          <w:tcPr>
+            <w:tcW w:w="3700" w:type="dxa"/>
+          </w:tcPr>
+          <w:p>
+            <w:pPr/>
+            <w:r>
+              <w:t xml:space="preserve">The rivals’ names and icons, in order.</w:t>
             </w:r>
           </w:p>
         </w:tc>
@@ -4469,7 +4734,7 @@
     <w:p>
       <w:pPr/>
       <w:r>
-        <w:t xml:space="preserve">As of 24 October 2026, MASTER CONFIG starts around line 741 and ends around line 1395 of DailyGrind\index.html. Use Ctrl+F to search for a part name, such as </w:t>
+        <w:t xml:space="preserve">As of 24 October 2026, MASTER CONFIG starts around line 762 and ends around line 1437 of DailyGrind\index.html. Use Ctrl+F to search for a part name, such as </w:t>
       </w:r>
       <w:r>
         <w:rPr>
@@ -4507,7 +4772,7 @@
     <w:p>
       <w:pPr/>
       <w:r>
-        <w:t>The three difficulty levels are set in a small table in the code, just below MASTER CONFIG (around line 1464 of index.html). They are not in MASTER CONFIG, so edit them there.</w:t>
+        <w:t>The three difficulty levels are set in a small table in the code, just below MASTER CONFIG (around line 1506 of index.html). They are not in MASTER CONFIG, so edit them there.</w:t>
       </w:r>
     </w:p>
     <w:tbl>

</xml_diff>

<commit_message>
AI rivals, step 2: the Life Score decides a rival game
- Seven categories (wealth, career, happiness, education, health,
  stability, first to the line), places worth 10/6/3/1 x weights
  (CONFIG.rivals.scoring). Happiness and health are game averages.
- Overview leaderboard ranks by Life Score; the end screen shows the
  standings, a category table and "best at" badges; rival games keep
  their own best finish. Rules line from CONFIG.
- UI check clean (it caught a knowledge NaN for a rival record without
  knowledge: guarded). Sims record each game's Life Score; calibration
  report to follow. CHANGELOG 80, Config Guide, CLAUDE.md, CODE_MAP.

Co-Authored-By: Claude Opus 5.5 <noreply@anthropic.com>
Claude-Session: https://claude.ai/code/session_01X4PpPPtrsCd6ZJRCWRgVNF
</commit_message>
<xml_diff>
--- a/docs/Daily Grind Config Guide.docx
+++ b/docs/Daily Grind Config Guide.docx
@@ -842,7 +842,7 @@
           <w:p>
             <w:pPr/>
             <w:r>
-              <w:t xml:space="preserve">A game with AI rivals: its length, how many industry-specific storylines it has, the rivals’ names, and how easy, medium and expert rivals play</w:t>
+              <w:t xml:space="preserve">A game with AI rivals: its length, its industry-specific storylines, the rivals’ names, how easy, medium and expert rivals play, and the Life Score that decides who wins</w:t>
             </w:r>
           </w:p>
         </w:tc>
@@ -3840,6 +3840,98 @@
           <w:p>
             <w:pPr/>
             <w:r>
+              <w:t xml:space="preserve">Change how a rival game is scored</w:t>
+            </w:r>
+          </w:p>
+        </w:tc>
+        <w:tc>
+          <w:tcPr>
+            <w:tcW w:w="1864" w:type="dxa"/>
+          </w:tcPr>
+          <w:p>
+            <w:pPr/>
+            <w:r>
+              <w:t xml:space="preserve">rivals: scoring, placePoints</w:t>
+            </w:r>
+          </w:p>
+        </w:tc>
+        <w:tc>
+          <w:tcPr>
+            <w:tcW w:w="1621" w:type="dxa"/>
+          </w:tcPr>
+          <w:p>
+            <w:pPr/>
+            <w:r>
+              <w:t xml:space="preserve">10, 6, 3, 1</w:t>
+            </w:r>
+          </w:p>
+        </w:tc>
+        <w:tc>
+          <w:tcPr>
+            <w:tcW w:w="3700" w:type="dxa"/>
+          </w:tcPr>
+          <w:p>
+            <w:pPr/>
+            <w:r>
+              <w:t xml:space="preserve">Points for 1st, 2nd, 3rd and 4th place in each Life Score category, before the category weight.</w:t>
+            </w:r>
+          </w:p>
+        </w:tc>
+      </w:tr>
+      <w:tr>
+        <w:tc>
+          <w:tcPr>
+            <w:tcW w:w="2175" w:type="dxa"/>
+          </w:tcPr>
+          <w:p>
+            <w:pPr/>
+            <w:r>
+              <w:t xml:space="preserve">Weight or drop a Life Score category</w:t>
+            </w:r>
+          </w:p>
+        </w:tc>
+        <w:tc>
+          <w:tcPr>
+            <w:tcW w:w="1864" w:type="dxa"/>
+          </w:tcPr>
+          <w:p>
+            <w:pPr/>
+            <w:r>
+              <w:t xml:space="preserve">rivals: scoring, categories</w:t>
+            </w:r>
+          </w:p>
+        </w:tc>
+        <w:tc>
+          <w:tcPr>
+            <w:tcW w:w="1621" w:type="dxa"/>
+          </w:tcPr>
+          <w:p>
+            <w:pPr/>
+            <w:r>
+              <w:t xml:space="preserve">wealth ×3, career ×2, happiness ×2, education ×2, health ×1, stability ×1, first ×1</w:t>
+            </w:r>
+          </w:p>
+        </w:tc>
+        <w:tc>
+          <w:tcPr>
+            <w:tcW w:w="3700" w:type="dxa"/>
+          </w:tcPr>
+          <w:p>
+            <w:pPr/>
+            <w:r>
+              <w:t xml:space="preserve">Each category has on (true or false) and weight. Turning one off leaves it out of the score, the table and the Rules.</w:t>
+            </w:r>
+          </w:p>
+        </w:tc>
+      </w:tr>
+      <w:tr>
+        <w:tc>
+          <w:tcPr>
+            <w:tcW w:w="2175" w:type="dxa"/>
+          </w:tcPr>
+          <w:p>
+            <w:pPr/>
+            <w:r>
               <w:t>Change coffee and cake</w:t>
             </w:r>
           </w:p>
@@ -4734,7 +4826,7 @@
     <w:p>
       <w:pPr/>
       <w:r>
-        <w:t xml:space="preserve">As of 24 October 2026, MASTER CONFIG starts around line 762 and ends around line 1437 of DailyGrind\index.html. Use Ctrl+F to search for a part name, such as </w:t>
+        <w:t xml:space="preserve">As of 24 October 2026, MASTER CONFIG starts around line 764 and ends around line 1447 of DailyGrind\index.html. Use Ctrl+F to search for a part name, such as </w:t>
       </w:r>
       <w:r>
         <w:rPr>
@@ -4772,7 +4864,7 @@
     <w:p>
       <w:pPr/>
       <w:r>
-        <w:t>The three difficulty levels are set in a small table in the code, just below MASTER CONFIG (around line 1506 of index.html). They are not in MASTER CONFIG, so edit them there.</w:t>
+        <w:t>The three difficulty levels are set in a small table in the code, just below MASTER CONFIG (around line 1516 of index.html). They are not in MASTER CONFIG, so edit them there.</w:t>
       </w:r>
     </w:p>
     <w:tbl>

</xml_diff>

<commit_message>
Rivals face your pressures: storyline chapters, life events, illness, shame
- Tonight's global and industry storyline chapters (happiness, health)
  hit every rival; rivals get their own small life events
  (CONFIG.rivals.lifeEvents) on their own dice.
- Rivals fall ill at your nightly chance (CONFIG.illness, illMix): no
  work or lessons, sick health loss, treatment if affordable.
- Money shame and low-energy health loss apply to rivals; their crisis
  days count no meal, debt, illness and no clothes for the job.
- Config Guide rows. Single games unchanged. Calibration report and
  CHANGELOG 81 to follow.

Co-Authored-By: Claude Opus 5.5 <noreply@anthropic.com>
Claude-Session: https://claude.ai/code/session_01X4PpPPtrsCd6ZJRCWRgVNF
</commit_message>
<xml_diff>
--- a/docs/Daily Grind Config Guide.docx
+++ b/docs/Daily Grind Config Guide.docx
@@ -3840,6 +3840,98 @@
           <w:p>
             <w:pPr/>
             <w:r>
+              <w:t xml:space="preserve">Change rivals’ daily ups and downs</w:t>
+            </w:r>
+          </w:p>
+        </w:tc>
+        <w:tc>
+          <w:tcPr>
+            <w:tcW w:w="1864" w:type="dxa"/>
+          </w:tcPr>
+          <w:p>
+            <w:pPr/>
+            <w:r>
+              <w:t xml:space="preserve">rivals: lifeEvents, chance and outcomes</w:t>
+            </w:r>
+          </w:p>
+        </w:tc>
+        <w:tc>
+          <w:tcPr>
+            <w:tcW w:w="1621" w:type="dxa"/>
+          </w:tcPr>
+          <w:p>
+            <w:pPr/>
+            <w:r>
+              <w:t xml:space="preserve">0.6 and a list</w:t>
+            </w:r>
+          </w:p>
+        </w:tc>
+        <w:tc>
+          <w:tcPr>
+            <w:tcW w:w="3700" w:type="dxa"/>
+          </w:tcPr>
+          <w:p>
+            <w:pPr/>
+            <w:r>
+              <w:t xml:space="preserve">Each night, the chance a rival gets one small life event, picked from the outcomes (effect tokens: h happiness, l health, e energy, c cash; 2~6 is a range). Tonight’s storyline chapters, illness and money shame also hit rivals as they hit you.</w:t>
+            </w:r>
+          </w:p>
+        </w:tc>
+      </w:tr>
+      <w:tr>
+        <w:tc>
+          <w:tcPr>
+            <w:tcW w:w="2175" w:type="dxa"/>
+          </w:tcPr>
+          <w:p>
+            <w:pPr/>
+            <w:r>
+              <w:t xml:space="preserve">Change which illnesses rivals catch</w:t>
+            </w:r>
+          </w:p>
+        </w:tc>
+        <w:tc>
+          <w:tcPr>
+            <w:tcW w:w="1864" w:type="dxa"/>
+          </w:tcPr>
+          <w:p>
+            <w:pPr/>
+            <w:r>
+              <w:t xml:space="preserve">rivals: illMix</w:t>
+            </w:r>
+          </w:p>
+        </w:tc>
+        <w:tc>
+          <w:tcPr>
+            <w:tcW w:w="1621" w:type="dxa"/>
+          </w:tcPr>
+          <w:p>
+            <w:pPr/>
+            <w:r>
+              <w:t xml:space="preserve">cold 0.5, flu 0.35, dengue 0.1, pneu 0.05</w:t>
+            </w:r>
+          </w:p>
+        </w:tc>
+        <w:tc>
+          <w:tcPr>
+            <w:tcW w:w="3700" w:type="dxa"/>
+          </w:tcPr>
+          <w:p>
+            <w:pPr/>
+            <w:r>
+              <w:t xml:space="preserve">When a rival falls ill (same nightly chance as yours), the share of each illness. A rival who can afford it pays for treatment.</w:t>
+            </w:r>
+          </w:p>
+        </w:tc>
+      </w:tr>
+      <w:tr>
+        <w:tc>
+          <w:tcPr>
+            <w:tcW w:w="2175" w:type="dxa"/>
+          </w:tcPr>
+          <w:p>
+            <w:pPr/>
+            <w:r>
               <w:t xml:space="preserve">Change how a rival game is scored</w:t>
             </w:r>
           </w:p>
@@ -4826,7 +4918,7 @@
     <w:p>
       <w:pPr/>
       <w:r>
-        <w:t xml:space="preserve">As of 24 October 2026, MASTER CONFIG starts around line 764 and ends around line 1447 of DailyGrind\index.html. Use Ctrl+F to search for a part name, such as </w:t>
+        <w:t xml:space="preserve">As of 24 October 2026, MASTER CONFIG starts around line 764 and ends around line 1453 of DailyGrind\index.html. Use Ctrl+F to search for a part name, such as </w:t>
       </w:r>
       <w:r>
         <w:rPr>
@@ -4864,7 +4956,7 @@
     <w:p>
       <w:pPr/>
       <w:r>
-        <w:t>The three difficulty levels are set in a small table in the code, just below MASTER CONFIG (around line 1516 of index.html). They are not in MASTER CONFIG, so edit them there.</w:t>
+        <w:t>The three difficulty levels are set in a small table in the code, just below MASTER CONFIG (around line 1522 of index.html). They are not in MASTER CONFIG, so edit them there.</w:t>
       </w:r>
     </w:p>
     <w:tbl>

</xml_diff>

<commit_message>
AI rivals: Health counts unwell nights; the job race
- Life Score Health: nights ill or under the poor-health line, fewer is
  better (ties share the place), instead of average health.
- Job race (CONFIG.rivals.jobRace): a role a medium or expert rival just
  took may have no openings for you the next day; chip on the job board,
  morning note, "got there first" on applying; up to 3 times a game.
- Rules, CHANGELOG 82, Config Guide, CLAUDE.md, CODE_MAP, UI check
  situation (clean). Simulation report to follow.

Co-Authored-By: Claude Opus 5.5 <noreply@anthropic.com>
Claude-Session: https://claude.ai/code/session_01X4PpPPtrsCd6ZJRCWRgVNF
</commit_message>
<xml_diff>
--- a/docs/Daily Grind Config Guide.docx
+++ b/docs/Daily Grind Config Guide.docx
@@ -3840,6 +3840,52 @@
           <w:p>
             <w:pPr/>
             <w:r>
+              <w:t xml:space="preserve">Change the job race</w:t>
+            </w:r>
+          </w:p>
+        </w:tc>
+        <w:tc>
+          <w:tcPr>
+            <w:tcW w:w="1864" w:type="dxa"/>
+          </w:tcPr>
+          <w:p>
+            <w:pPr/>
+            <w:r>
+              <w:t xml:space="preserve">rivals: jobRace, chance, maxPerGame and levels</w:t>
+            </w:r>
+          </w:p>
+        </w:tc>
+        <w:tc>
+          <w:tcPr>
+            <w:tcW w:w="1621" w:type="dxa"/>
+          </w:tcPr>
+          <w:p>
+            <w:pPr/>
+            <w:r>
+              <w:t xml:space="preserve">0.5, 3, medium and expert</w:t>
+            </w:r>
+          </w:p>
+        </w:tc>
+        <w:tc>
+          <w:tcPr>
+            <w:tcW w:w="3700" w:type="dxa"/>
+          </w:tcPr>
+          <w:p>
+            <w:pPr/>
+            <w:r>
+              <w:t xml:space="preserve">When a rival of these levels gets a job, the chance it took the last opening, so that role has no openings for you the next day. At most maxPerGame times a game. chance 0 turns it off.</w:t>
+            </w:r>
+          </w:p>
+        </w:tc>
+      </w:tr>
+      <w:tr>
+        <w:tc>
+          <w:tcPr>
+            <w:tcW w:w="2175" w:type="dxa"/>
+          </w:tcPr>
+          <w:p>
+            <w:pPr/>
+            <w:r>
               <w:t xml:space="preserve">Change rivals’ daily ups and downs</w:t>
             </w:r>
           </w:p>
@@ -4918,7 +4964,7 @@
     <w:p>
       <w:pPr/>
       <w:r>
-        <w:t xml:space="preserve">As of 24 October 2026, MASTER CONFIG starts around line 764 and ends around line 1453 of DailyGrind\index.html. Use Ctrl+F to search for a part name, such as </w:t>
+        <w:t xml:space="preserve">As of 24 October 2026, MASTER CONFIG starts around line 764 and ends around line 1456 of DailyGrind\index.html. Use Ctrl+F to search for a part name, such as </w:t>
       </w:r>
       <w:r>
         <w:rPr>
@@ -4956,7 +5002,7 @@
     <w:p>
       <w:pPr/>
       <w:r>
-        <w:t>The three difficulty levels are set in a small table in the code, just below MASTER CONFIG (around line 1522 of index.html). They are not in MASTER CONFIG, so edit them there.</w:t>
+        <w:t>The three difficulty levels are set in a small table in the code, just below MASTER CONFIG (around line 1525 of index.html). They are not in MASTER CONFIG, so edit them there.</w:t>
       </w:r>
     </w:p>
     <w:tbl>

</xml_diff>

<commit_message>
Rival relationships: true chips, visible congratulations, docs, UI check
- Arguments and tension cost relationship only, so the happiness on a
  call or chat row is always what you get (the UI check caught calls
  taking an extra point after an argument).
- Congratulating from the morning pop-up shows its result and its
  refusal as forced toasts (ordinary toasts are hidden behind pop-ups).
- CHANGELOG 84, Config Guide rows for CONFIG.rivals.social, CLAUDE.md,
  CODE_MAP; UI check situations for meeting a rival, home calls and the
  Calls app (clean at desktop and phone width).

Co-Authored-By: Claude Opus 5.5 <noreply@anthropic.com>
Claude-Session: https://claude.ai/code/session_01X4PpPPtrsCd6ZJRCWRgVNF
</commit_message>
<xml_diff>
--- a/docs/Daily Grind Config Guide.docx
+++ b/docs/Daily Grind Config Guide.docx
@@ -3840,6 +3840,190 @@
           <w:p>
             <w:pPr/>
             <w:r>
+              <w:t xml:space="preserve">Change how relationships with rivals build</w:t>
+            </w:r>
+          </w:p>
+        </w:tc>
+        <w:tc>
+          <w:tcPr>
+            <w:tcW w:w="1864" w:type="dxa"/>
+          </w:tcPr>
+          <w:p>
+            <w:pPr/>
+            <w:r>
+              <w:t xml:space="preserve">rivals: social, chat, hello, ignore, congratulate</w:t>
+            </w:r>
+          </w:p>
+        </w:tc>
+        <w:tc>
+          <w:tcPr>
+            <w:tcW w:w="1621" w:type="dxa"/>
+          </w:tcPr>
+          <w:p>
+            <w:pPr/>
+            <w:r>
+              <w:t xml:space="preserve">30 min +8, 10 min +3, −3, 15 min +6</w:t>
+            </w:r>
+          </w:p>
+        </w:tc>
+        <w:tc>
+          <w:tcPr>
+            <w:tcW w:w="3700" w:type="dxa"/>
+          </w:tcPr>
+          <w:p>
+            <w:pPr/>
+            <w:r>
+              <w:t xml:space="preserve">Time, happiness and relationship change for each way of building a relationship. Building one always costs time; ignoring is free.</w:t>
+            </w:r>
+          </w:p>
+        </w:tc>
+      </w:tr>
+      <w:tr>
+        <w:tc>
+          <w:tcPr>
+            <w:tcW w:w="2175" w:type="dxa"/>
+          </w:tcPr>
+          <w:p>
+            <w:pPr/>
+            <w:r>
+              <w:t xml:space="preserve">Change rival calls</w:t>
+            </w:r>
+          </w:p>
+        </w:tc>
+        <w:tc>
+          <w:tcPr>
+            <w:tcW w:w="1864" w:type="dxa"/>
+          </w:tcPr>
+          <w:p>
+            <w:pPr/>
+            <w:r>
+              <w:t xml:space="preserve">rivals: social, call</w:t>
+            </w:r>
+          </w:p>
+        </w:tc>
+        <w:tc>
+          <w:tcPr>
+            <w:tcW w:w="1621" w:type="dxa"/>
+          </w:tcPr>
+          <w:p>
+            <w:pPr/>
+            <w:r>
+              <w:t xml:space="preserve">30 min, +1 happiness, roll −1/0/+1/+2</w:t>
+            </w:r>
+          </w:p>
+        </w:tc>
+        <w:tc>
+          <w:tcPr>
+            <w:tcW w:w="3700" w:type="dxa"/>
+          </w:tcPr>
+          <w:p>
+            <w:pPr/>
+            <w:r>
+              <w:t xml:space="preserve">Calls by phone (one rival or a group); calls from home use the family call’s time and happiness. roll is a list of [change, chance] for each rival on a call.</w:t>
+            </w:r>
+          </w:p>
+        </w:tc>
+      </w:tr>
+      <w:tr>
+        <w:tc>
+          <w:tcPr>
+            <w:tcW w:w="2175" w:type="dxa"/>
+          </w:tcPr>
+          <w:p>
+            <w:pPr/>
+            <w:r>
+              <w:t xml:space="preserve">Make feuds harder or easier to mend</w:t>
+            </w:r>
+          </w:p>
+        </w:tc>
+        <w:tc>
+          <w:tcPr>
+            <w:tcW w:w="1864" w:type="dxa"/>
+          </w:tcPr>
+          <w:p>
+            <w:pPr/>
+            <w:r>
+              <w:t xml:space="preserve">rivals: social, tension</w:t>
+            </w:r>
+          </w:p>
+        </w:tc>
+        <w:tc>
+          <w:tcPr>
+            <w:tcW w:w="1621" w:type="dxa"/>
+          </w:tcPr>
+          <w:p>
+            <w:pPr/>
+            <w:r>
+              <w:t xml:space="preserve">per 0.01, max 0.6</w:t>
+            </w:r>
+          </w:p>
+        </w:tc>
+        <w:tc>
+          <w:tcPr>
+            <w:tcW w:w="3700" w:type="dxa"/>
+          </w:tcPr>
+          <w:p>
+            <w:pPr/>
+            <w:r>
+              <w:t xml:space="preserve">Below 0, the chance a relationship gain backfires into a loss: per point below zero, up to max.</w:t>
+            </w:r>
+          </w:p>
+        </w:tc>
+      </w:tr>
+      <w:tr>
+        <w:tc>
+          <w:tcPr>
+            <w:tcW w:w="2175" w:type="dxa"/>
+          </w:tcPr>
+          <w:p>
+            <w:pPr/>
+            <w:r>
+              <w:t xml:space="preserve">Change what friends and enemies do</w:t>
+            </w:r>
+          </w:p>
+        </w:tc>
+        <w:tc>
+          <w:tcPr>
+            <w:tcW w:w="1864" w:type="dxa"/>
+          </w:tcPr>
+          <w:p>
+            <w:pPr/>
+            <w:r>
+              <w:t xml:space="preserve">rivals: social, friendAt, enemyAt, friendTipChance, enemyRaceBonus, racedRel, encounterChance</w:t>
+            </w:r>
+          </w:p>
+        </w:tc>
+        <w:tc>
+          <w:tcPr>
+            <w:tcW w:w="1621" w:type="dxa"/>
+          </w:tcPr>
+          <w:p>
+            <w:pPr/>
+            <w:r>
+              <w:t xml:space="preserve">40, −40, 0.15, 0.25, −10, 0.35</w:t>
+            </w:r>
+          </w:p>
+        </w:tc>
+        <w:tc>
+          <w:tcPr>
+            <w:tcW w:w="3700" w:type="dxa"/>
+          </w:tcPr>
+          <w:p>
+            <w:pPr/>
+            <w:r>
+              <w:t xml:space="preserve">The relationship needed for friend or enemy, a friend’s chance of a morning job tip, how much harder enemies race you, what a lost race costs them with you, and the chance of meeting a rival where they spend their days.</w:t>
+            </w:r>
+          </w:p>
+        </w:tc>
+      </w:tr>
+      <w:tr>
+        <w:tc>
+          <w:tcPr>
+            <w:tcW w:w="2175" w:type="dxa"/>
+          </w:tcPr>
+          <w:p>
+            <w:pPr/>
+            <w:r>
               <w:t xml:space="preserve">Change the job race</w:t>
             </w:r>
           </w:p>
@@ -4964,7 +5148,7 @@
     <w:p>
       <w:pPr/>
       <w:r>
-        <w:t xml:space="preserve">As of 24 October 2026, MASTER CONFIG starts around line 764 and ends around line 1456 of DailyGrind\index.html. Use Ctrl+F to search for a part name, such as </w:t>
+        <w:t xml:space="preserve">As of 24 October 2026, MASTER CONFIG starts around line 764 and ends around line 1468 of DailyGrind\index.html. Use Ctrl+F to search for a part name, such as </w:t>
       </w:r>
       <w:r>
         <w:rPr>
@@ -5002,7 +5186,7 @@
     <w:p>
       <w:pPr/>
       <w:r>
-        <w:t>The three difficulty levels are set in a small table in the code, just below MASTER CONFIG (around line 1525 of index.html). They are not in MASTER CONFIG, so edit them there.</w:t>
+        <w:t>The three difficulty levels are set in a small table in the code, just below MASTER CONFIG (around line 1537 of index.html). They are not in MASTER CONFIG, so edit them there.</w:t>
       </w:r>
     </w:p>
     <w:tbl>

</xml_diff>

<commit_message>
Arguments with rivals cost 2 happiness
A call that lands on -1, or any interaction that backfires through
tension, now also costs CONFIG.rivals.social.argument.happiness (-2)
per rival. Rows that can end in an argument show a warning chip and
carry a chance class, so the UI check compares only their time chip.

Co-Authored-By: Claude Opus 5.5 <noreply@anthropic.com>
Claude-Session: https://claude.ai/code/session_01X4PpPPtrsCd6ZJRCWRgVNF
</commit_message>
<xml_diff>
--- a/docs/Daily Grind Config Guide.docx
+++ b/docs/Daily Grind Config Guide.docx
@@ -3978,6 +3978,52 @@
           <w:p>
             <w:pPr/>
             <w:r>
+              <w:t xml:space="preserve">Change what an argument with a rival costs you</w:t>
+            </w:r>
+          </w:p>
+        </w:tc>
+        <w:tc>
+          <w:tcPr>
+            <w:tcW w:w="1864" w:type="dxa"/>
+          </w:tcPr>
+          <w:p>
+            <w:pPr/>
+            <w:r>
+              <w:t xml:space="preserve">rivals: social, argument</w:t>
+            </w:r>
+          </w:p>
+        </w:tc>
+        <w:tc>
+          <w:tcPr>
+            <w:tcW w:w="1621" w:type="dxa"/>
+          </w:tcPr>
+          <w:p>
+            <w:pPr/>
+            <w:r>
+              <w:t xml:space="preserve">happiness −2</w:t>
+            </w:r>
+          </w:p>
+        </w:tc>
+        <w:tc>
+          <w:tcPr>
+            <w:tcW w:w="3700" w:type="dxa"/>
+          </w:tcPr>
+          <w:p>
+            <w:pPr/>
+            <w:r>
+              <w:t xml:space="preserve">Happiness lost for each rival you argue with: a call that lands on −1, or any interaction that backfires through tension. Comes on top of the action’s own happiness. 0 turns it off.</w:t>
+            </w:r>
+          </w:p>
+        </w:tc>
+      </w:tr>
+      <w:tr>
+        <w:tc>
+          <w:tcPr>
+            <w:tcW w:w="2175" w:type="dxa"/>
+          </w:tcPr>
+          <w:p>
+            <w:pPr/>
+            <w:r>
               <w:t xml:space="preserve">Change what friends and enemies do</w:t>
             </w:r>
           </w:p>
@@ -5148,7 +5194,7 @@
     <w:p>
       <w:pPr/>
       <w:r>
-        <w:t xml:space="preserve">As of 24 October 2026, MASTER CONFIG starts around line 764 and ends around line 1468 of DailyGrind\index.html. Use Ctrl+F to search for a part name, such as </w:t>
+        <w:t xml:space="preserve">As of 24 October 2026, MASTER CONFIG starts around line 764 and ends around line 1469 of DailyGrind\index.html. Use Ctrl+F to search for a part name, such as </w:t>
       </w:r>
       <w:r>
         <w:rPr>
@@ -5186,7 +5232,7 @@
     <w:p>
       <w:pPr/>
       <w:r>
-        <w:t>The three difficulty levels are set in a small table in the code, just below MASTER CONFIG (around line 1537 of index.html). They are not in MASTER CONFIG, so edit them there.</w:t>
+        <w:t>The three difficulty levels are set in a small table in the code, just below MASTER CONFIG (around line 1538 of index.html). They are not in MASTER CONFIG, so edit them there.</w:t>
       </w:r>
     </w:p>
     <w:tbl>

</xml_diff>

<commit_message>
AI rivals: loans, bets and the Messages app
Rivals can ask to borrow money or offer a bet through a new Messages
app, and you can ask them too. Loans run 3 days at 10%, with a reminder
the morning before yours is due; not paying a rival back in full costs
-50 with them, -25 with every other rival and -25 happiness, once.
Bets go to whoever grows their net worth more over 3 days. Loans and
held stakes count in net worth, so money only moves between wallets.

Co-Authored-By: Claude Opus 5.5 <noreply@anthropic.com>
Claude-Session: https://claude.ai/code/session_01X4PpPPtrsCd6ZJRCWRgVNF
</commit_message>
<xml_diff>
--- a/docs/Daily Grind Config Guide.docx
+++ b/docs/Daily Grind Config Guide.docx
@@ -4024,6 +4024,282 @@
           <w:p>
             <w:pPr/>
             <w:r>
+              <w:t xml:space="preserve">Change how often rivals message you</w:t>
+            </w:r>
+          </w:p>
+        </w:tc>
+        <w:tc>
+          <w:tcPr>
+            <w:tcW w:w="1864" w:type="dxa"/>
+          </w:tcPr>
+          <w:p>
+            <w:pPr/>
+            <w:r>
+              <w:t xml:space="preserve">rivals: money, messageChance, firstDay, messageDays, replyMinutes, noMinutes</w:t>
+            </w:r>
+          </w:p>
+        </w:tc>
+        <w:tc>
+          <w:tcPr>
+            <w:tcW w:w="1621" w:type="dxa"/>
+          </w:tcPr>
+          <w:p>
+            <w:pPr/>
+            <w:r>
+              <w:t xml:space="preserve">0.35, 2, 2, 10, 5</w:t>
+            </w:r>
+          </w:p>
+        </w:tc>
+        <w:tc>
+          <w:tcPr>
+            <w:tcW w:w="3700" w:type="dxa"/>
+          </w:tcPr>
+          <w:p>
+            <w:pPr/>
+            <w:r>
+              <w:t xml:space="preserve">The chance a rival messages you each night (one a night at most), from the end of which day, how many days a message lasts, and the minutes to answer (or to say no) in the Messages app.</w:t>
+            </w:r>
+          </w:p>
+        </w:tc>
+      </w:tr>
+      <w:tr>
+        <w:tc>
+          <w:tcPr>
+            <w:tcW w:w="2175" w:type="dxa"/>
+          </w:tcPr>
+          <w:p>
+            <w:pPr/>
+            <w:r>
+              <w:t xml:space="preserve">Change loans you give rivals</w:t>
+            </w:r>
+          </w:p>
+        </w:tc>
+        <w:tc>
+          <w:tcPr>
+            <w:tcW w:w="1864" w:type="dxa"/>
+          </w:tcPr>
+          <w:p>
+            <w:pPr/>
+            <w:r>
+              <w:t xml:space="preserve">rivals: money, loan, min, max, interest, days, lendRel, refuseRel, repay</w:t>
+            </w:r>
+          </w:p>
+        </w:tc>
+        <w:tc>
+          <w:tcPr>
+            <w:tcW w:w="1621" w:type="dxa"/>
+          </w:tcPr>
+          <w:p>
+            <w:pPr/>
+            <w:r>
+              <w:t xml:space="preserve">$60–$150, 10%, 3 days, +6, −3, 85% (medium)</w:t>
+            </w:r>
+          </w:p>
+        </w:tc>
+        <w:tc>
+          <w:tcPr>
+            <w:tcW w:w="3700" w:type="dxa"/>
+          </w:tcPr>
+          <w:p>
+            <w:pPr/>
+            <w:r>
+              <w:t xml:space="preserve">What rivals ask to borrow, the interest and days until it is due, the relationship change for lending or saying no, and each level’s chance of paying on the due morning (friendMod/enemyMod adjust it).</w:t>
+            </w:r>
+          </w:p>
+        </w:tc>
+      </w:tr>
+      <w:tr>
+        <w:tc>
+          <w:tcPr>
+            <w:tcW w:w="2175" w:type="dxa"/>
+          </w:tcPr>
+          <w:p>
+            <w:pPr/>
+            <w:r>
+              <w:t xml:space="preserve">Change what happens when a rival doesn’t pay</w:t>
+            </w:r>
+          </w:p>
+        </w:tc>
+        <w:tc>
+          <w:tcPr>
+            <w:tcW w:w="1864" w:type="dxa"/>
+          </w:tcPr>
+          <w:p>
+            <w:pPr/>
+            <w:r>
+              <w:t xml:space="preserve">rivals: money, loan, lateDays, rivalDefaultRel, rivalDefaultHappiness</w:t>
+            </w:r>
+          </w:p>
+        </w:tc>
+        <w:tc>
+          <w:tcPr>
+            <w:tcW w:w="1621" w:type="dxa"/>
+          </w:tcPr>
+          <w:p>
+            <w:pPr/>
+            <w:r>
+              <w:t xml:space="preserve">2, −15, −3</w:t>
+            </w:r>
+          </w:p>
+        </w:tc>
+        <w:tc>
+          <w:tcPr>
+            <w:tcW w:w="3700" w:type="dxa"/>
+          </w:tcPr>
+          <w:p>
+            <w:pPr/>
+            <w:r>
+              <w:t xml:space="preserve">How many mornings late a rival may be before the loan is lost, and what that costs your relationship and happiness.</w:t>
+            </w:r>
+          </w:p>
+        </w:tc>
+      </w:tr>
+      <w:tr>
+        <w:tc>
+          <w:tcPr>
+            <w:tcW w:w="2175" w:type="dxa"/>
+          </w:tcPr>
+          <w:p>
+            <w:pPr/>
+            <w:r>
+              <w:t xml:space="preserve">Change loans you take from rivals</w:t>
+            </w:r>
+          </w:p>
+        </w:tc>
+        <w:tc>
+          <w:tcPr>
+            <w:tcW w:w="1864" w:type="dxa"/>
+          </w:tcPr>
+          <w:p>
+            <w:pPr/>
+            <w:r>
+              <w:t xml:space="preserve">rivals: money, loan, step, maxBorrow, borrowFrom, willing, askedNoRel</w:t>
+            </w:r>
+          </w:p>
+        </w:tc>
+        <w:tc>
+          <w:tcPr>
+            <w:tcW w:w="1621" w:type="dxa"/>
+          </w:tcPr>
+          <w:p>
+            <w:pPr/>
+            <w:r>
+              <w:t xml:space="preserve">$50, $300, 15, 70% (medium), −3</w:t>
+            </w:r>
+          </w:p>
+        </w:tc>
+        <w:tc>
+          <w:tcPr>
+            <w:tcW w:w="3700" w:type="dxa"/>
+          </w:tcPr>
+          <w:p>
+            <w:pPr/>
+            <w:r>
+              <w:t xml:space="preserve">The amounts you can ask for, the relationship needed, each level’s willingness to lend, and the relationship lost when they say no.</w:t>
+            </w:r>
+          </w:p>
+        </w:tc>
+      </w:tr>
+      <w:tr>
+        <w:tc>
+          <w:tcPr>
+            <w:tcW w:w="2175" w:type="dxa"/>
+          </w:tcPr>
+          <w:p>
+            <w:pPr/>
+            <w:r>
+              <w:t xml:space="preserve">Change the penalty for not paying a rival back</w:t>
+            </w:r>
+          </w:p>
+        </w:tc>
+        <w:tc>
+          <w:tcPr>
+            <w:tcW w:w="1864" w:type="dxa"/>
+          </w:tcPr>
+          <w:p>
+            <w:pPr/>
+            <w:r>
+              <w:t xml:space="preserve">rivals: money, loan, defaultRel, defaultOthersRel, defaultHappiness</w:t>
+            </w:r>
+          </w:p>
+        </w:tc>
+        <w:tc>
+          <w:tcPr>
+            <w:tcW w:w="1621" w:type="dxa"/>
+          </w:tcPr>
+          <w:p>
+            <w:pPr/>
+            <w:r>
+              <w:t xml:space="preserve">−50, −25, −25</w:t>
+            </w:r>
+          </w:p>
+        </w:tc>
+        <w:tc>
+          <w:tcPr>
+            <w:tcW w:w="3700" w:type="dxa"/>
+          </w:tcPr>
+          <w:p>
+            <w:pPr/>
+            <w:r>
+              <w:t xml:space="preserve">Applied once if what you owe isn’t paid in full on the due morning: with the lender, with every other rival, and your happiness. The rest is collected later with no further penalty.</w:t>
+            </w:r>
+          </w:p>
+        </w:tc>
+      </w:tr>
+      <w:tr>
+        <w:tc>
+          <w:tcPr>
+            <w:tcW w:w="2175" w:type="dxa"/>
+          </w:tcPr>
+          <w:p>
+            <w:pPr/>
+            <w:r>
+              <w:t xml:space="preserve">Change friendly bets</w:t>
+            </w:r>
+          </w:p>
+        </w:tc>
+        <w:tc>
+          <w:tcPr>
+            <w:tcW w:w="1864" w:type="dxa"/>
+          </w:tcPr>
+          <w:p>
+            <w:pPr/>
+            <w:r>
+              <w:t xml:space="preserve">rivals: money, bet, stake, days, winHappiness, loseHappiness, rel, enemyLoseRel, accept</w:t>
+            </w:r>
+          </w:p>
+        </w:tc>
+        <w:tc>
+          <w:tcPr>
+            <w:tcW w:w="1621" w:type="dxa"/>
+          </w:tcPr>
+          <w:p>
+            <w:pPr/>
+            <w:r>
+              <w:t xml:space="preserve">$50, 3 days, +3, −2, +2, −4, 60% (medium)</w:t>
+            </w:r>
+          </w:p>
+        </w:tc>
+        <w:tc>
+          <w:tcPr>
+            <w:tcW w:w="3700" w:type="dxa"/>
+          </w:tcPr>
+          <w:p>
+            <w:pPr/>
+            <w:r>
+              <w:t xml:space="preserve">The stake each side puts up, how many days the bet runs, the happiness for winning or losing, the relationship change, and each level’s chance of taking your bet.</w:t>
+            </w:r>
+          </w:p>
+        </w:tc>
+      </w:tr>
+      <w:tr>
+        <w:tc>
+          <w:tcPr>
+            <w:tcW w:w="2175" w:type="dxa"/>
+          </w:tcPr>
+          <w:p>
+            <w:pPr/>
+            <w:r>
               <w:t xml:space="preserve">Change what friends and enemies do</w:t>
             </w:r>
           </w:p>
@@ -5194,7 +5470,7 @@
     <w:p>
       <w:pPr/>
       <w:r>
-        <w:t xml:space="preserve">As of 24 October 2026, MASTER CONFIG starts around line 764 and ends around line 1469 of DailyGrind\index.html. Use Ctrl+F to search for a part name, such as </w:t>
+        <w:t xml:space="preserve">As of 24 October 2026, MASTER CONFIG starts around line 764 and ends around line 1483 of DailyGrind\index.html. Use Ctrl+F to search for a part name, such as </w:t>
       </w:r>
       <w:r>
         <w:rPr>
@@ -5232,7 +5508,7 @@
     <w:p>
       <w:pPr/>
       <w:r>
-        <w:t>The three difficulty levels are set in a small table in the code, just below MASTER CONFIG (around line 1538 of index.html). They are not in MASTER CONFIG, so edit them there.</w:t>
+        <w:t>The three difficulty levels are set in a small table in the code, just below MASTER CONFIG (around line 1552 of index.html). They are not in MASTER CONFIG, so edit them there.</w:t>
       </w:r>
     </w:p>
     <w:tbl>

</xml_diff>

<commit_message>
AI rivals: flatmates, study groups and rival cards
A friendly rival can move in: rent is split in half, living together
moves both your moods each night, and when they're home you can cook,
hang out, do chores or clear the air together. Lessons with a friendly
rival on the same pathway become a study group. Some nights bring a
decision involving a rival (a lift, a birthday, a rumour, covering a
shift, revision help, soup, a party, a move).

Co-Authored-By: Claude Opus 5.5 <noreply@anthropic.com>
Claude-Session: https://claude.ai/code/session_01X4PpPPtrsCd6ZJRCWRgVNF
</commit_message>
<xml_diff>
--- a/docs/Daily Grind Config Guide.docx
+++ b/docs/Daily Grind Config Guide.docx
@@ -4300,6 +4300,282 @@
           <w:p>
             <w:pPr/>
             <w:r>
+              <w:t xml:space="preserve">Change who will be your flatmate</w:t>
+            </w:r>
+          </w:p>
+        </w:tc>
+        <w:tc>
+          <w:tcPr>
+            <w:tcW w:w="1864" w:type="dxa"/>
+          </w:tcPr>
+          <w:p>
+            <w:pPr/>
+            <w:r>
+              <w:t xml:space="preserve">rivals: together, flat, inviteMinutes, flatFrom, willing, inviteNoRel</w:t>
+            </w:r>
+          </w:p>
+        </w:tc>
+        <w:tc>
+          <w:tcPr>
+            <w:tcW w:w="1621" w:type="dxa"/>
+          </w:tcPr>
+          <w:p>
+            <w:pPr/>
+            <w:r>
+              <w:t xml:space="preserve">30 min, 15, 70% (medium), −2</w:t>
+            </w:r>
+          </w:p>
+        </w:tc>
+        <w:tc>
+          <w:tcPr>
+            <w:tcW w:w="3700" w:type="dxa"/>
+          </w:tcPr>
+          <w:p>
+            <w:pPr/>
+            <w:r>
+              <w:t xml:space="preserve">The time to invite a rival, the relationship they need, each level’s willingness to move in, and the relationship lost when they say no.</w:t>
+            </w:r>
+          </w:p>
+        </w:tc>
+      </w:tr>
+      <w:tr>
+        <w:tc>
+          <w:tcPr>
+            <w:tcW w:w="2175" w:type="dxa"/>
+          </w:tcPr>
+          <w:p>
+            <w:pPr/>
+            <w:r>
+              <w:t xml:space="preserve">Change how flatmates pay rent</w:t>
+            </w:r>
+          </w:p>
+        </w:tc>
+        <w:tc>
+          <w:tcPr>
+            <w:tcW w:w="1864" w:type="dxa"/>
+          </w:tcPr>
+          <w:p>
+            <w:pPr/>
+            <w:r>
+              <w:t xml:space="preserve">rivals: together, flat, skip, skipEnemyMod, skipRel, skipHappiness</w:t>
+            </w:r>
+          </w:p>
+        </w:tc>
+        <w:tc>
+          <w:tcPr>
+            <w:tcW w:w="1621" w:type="dxa"/>
+          </w:tcPr>
+          <w:p>
+            <w:pPr/>
+            <w:r>
+              <w:t xml:space="preserve">3–25% by level, +0.1, −8, −3</w:t>
+            </w:r>
+          </w:p>
+        </w:tc>
+        <w:tc>
+          <w:tcPr>
+            <w:tcW w:w="3700" w:type="dxa"/>
+          </w:tcPr>
+          <w:p>
+            <w:pPr/>
+            <w:r>
+              <w:t xml:space="preserve">The chance a flatmate skips their half of the rent on rent day (higher below 0); you then pay it all and lose relationship and happiness.</w:t>
+            </w:r>
+          </w:p>
+        </w:tc>
+      </w:tr>
+      <w:tr>
+        <w:tc>
+          <w:tcPr>
+            <w:tcW w:w="2175" w:type="dxa"/>
+          </w:tcPr>
+          <w:p>
+            <w:pPr/>
+            <w:r>
+              <w:t xml:space="preserve">Change living together</w:t>
+            </w:r>
+          </w:p>
+        </w:tc>
+        <w:tc>
+          <w:tcPr>
+            <w:tcW w:w="1864" w:type="dxa"/>
+          </w:tcPr>
+          <w:p>
+            <w:pPr/>
+            <w:r>
+              <w:t xml:space="preserve">rivals: together, flat, nightHappiness, nightRel, leaveAt, kickMinutes, kickRel</w:t>
+            </w:r>
+          </w:p>
+        </w:tc>
+        <w:tc>
+          <w:tcPr>
+            <w:tcW w:w="1621" w:type="dxa"/>
+          </w:tcPr>
+          <w:p>
+            <w:pPr/>
+            <w:r>
+              <w:t xml:space="preserve">+2/+1/0/−3, +1, −15, 10 min, −10</w:t>
+            </w:r>
+          </w:p>
+        </w:tc>
+        <w:tc>
+          <w:tcPr>
+            <w:tcW w:w="3700" w:type="dxa"/>
+          </w:tcPr>
+          <w:p>
+            <w:pPr/>
+            <w:r>
+              <w:t xml:space="preserve">Happiness for both of you each night by how you get on, the nightly relationship drift, when they move out on their own, and asking them to leave.</w:t>
+            </w:r>
+          </w:p>
+        </w:tc>
+      </w:tr>
+      <w:tr>
+        <w:tc>
+          <w:tcPr>
+            <w:tcW w:w="2175" w:type="dxa"/>
+          </w:tcPr>
+          <w:p>
+            <w:pPr/>
+            <w:r>
+              <w:t xml:space="preserve">Change time with your flatmate</w:t>
+            </w:r>
+          </w:p>
+        </w:tc>
+        <w:tc>
+          <w:tcPr>
+            <w:tcW w:w="1864" w:type="dxa"/>
+          </w:tcPr>
+          <w:p>
+            <w:pPr/>
+            <w:r>
+              <w:t xml:space="preserve">rivals: together, flat, homeChance, cook, hangout, chores, clearAir</w:t>
+            </w:r>
+          </w:p>
+        </w:tc>
+        <w:tc>
+          <w:tcPr>
+            <w:tcW w:w="1621" w:type="dxa"/>
+          </w:tcPr>
+          <w:p>
+            <w:pPr/>
+            <w:r>
+              <w:t xml:space="preserve">60%; 45 min +2 +4; 1h +4 +3; 30 min +1 health +2; 30 min +6 (below 15)</w:t>
+            </w:r>
+          </w:p>
+        </w:tc>
+        <w:tc>
+          <w:tcPr>
+            <w:tcW w:w="3700" w:type="dxa"/>
+          </w:tcPr>
+          <w:p>
+            <w:pPr/>
+            <w:r>
+              <w:t xml:space="preserve">How often they are home, and the time, happiness or health and relationship of cooking dinner (also a meal, you pay half), hanging out, chores and clearing the air.</w:t>
+            </w:r>
+          </w:p>
+        </w:tc>
+      </w:tr>
+      <w:tr>
+        <w:tc>
+          <w:tcPr>
+            <w:tcW w:w="2175" w:type="dxa"/>
+          </w:tcPr>
+          <w:p>
+            <w:pPr/>
+            <w:r>
+              <w:t xml:space="preserve">Change study groups</w:t>
+            </w:r>
+          </w:p>
+        </w:tc>
+        <w:tc>
+          <w:tcPr>
+            <w:tcW w:w="1864" w:type="dxa"/>
+          </w:tcPr>
+          <w:p>
+            <w:pPr/>
+            <w:r>
+              <w:t xml:space="preserve">rivals: together, study, groupKnowledge, groupHappiness, groupRel, partnerKnowledge</w:t>
+            </w:r>
+          </w:p>
+        </w:tc>
+        <w:tc>
+          <w:tcPr>
+            <w:tcW w:w="1621" w:type="dxa"/>
+          </w:tcPr>
+          <w:p>
+            <w:pPr/>
+            <w:r>
+              <w:t xml:space="preserve">+1, +1, +2, +1</w:t>
+            </w:r>
+          </w:p>
+        </w:tc>
+        <w:tc>
+          <w:tcPr>
+            <w:tcW w:w="3700" w:type="dxa"/>
+          </w:tcPr>
+          <w:p>
+            <w:pPr/>
+            <w:r>
+              <w:t xml:space="preserve">What a lesson adds when a friendly rival studies the same pathway: your knowledge and happiness, the relationship, and the partner’s knowledge.</w:t>
+            </w:r>
+          </w:p>
+        </w:tc>
+      </w:tr>
+      <w:tr>
+        <w:tc>
+          <w:tcPr>
+            <w:tcW w:w="2175" w:type="dxa"/>
+          </w:tcPr>
+          <w:p>
+            <w:pPr/>
+            <w:r>
+              <w:t xml:space="preserve">Change how often rival cards come up</w:t>
+            </w:r>
+          </w:p>
+        </w:tc>
+        <w:tc>
+          <w:tcPr>
+            <w:tcW w:w="1864" w:type="dxa"/>
+          </w:tcPr>
+          <w:p>
+            <w:pPr/>
+            <w:r>
+              <w:t xml:space="preserve">rivals: together, cards, chance, gap</w:t>
+            </w:r>
+          </w:p>
+        </w:tc>
+        <w:tc>
+          <w:tcPr>
+            <w:tcW w:w="1621" w:type="dxa"/>
+          </w:tcPr>
+          <w:p>
+            <w:pPr/>
+            <w:r>
+              <w:t xml:space="preserve">0.3, 2</w:t>
+            </w:r>
+          </w:p>
+        </w:tc>
+        <w:tc>
+          <w:tcPr>
+            <w:tcW w:w="3700" w:type="dxa"/>
+          </w:tcPr>
+          <w:p>
+            <w:pPr/>
+            <w:r>
+              <w:t xml:space="preserve">The chance of a decision card involving a rival each night, and the nights between them. The cards are in RIVAL_CARDS.</w:t>
+            </w:r>
+          </w:p>
+        </w:tc>
+      </w:tr>
+      <w:tr>
+        <w:tc>
+          <w:tcPr>
+            <w:tcW w:w="2175" w:type="dxa"/>
+          </w:tcPr>
+          <w:p>
+            <w:pPr/>
+            <w:r>
               <w:t xml:space="preserve">Change what friends and enemies do</w:t>
             </w:r>
           </w:p>
@@ -5470,7 +5746,7 @@
     <w:p>
       <w:pPr/>
       <w:r>
-        <w:t xml:space="preserve">As of 24 October 2026, MASTER CONFIG starts around line 764 and ends around line 1483 of DailyGrind\index.html. Use Ctrl+F to search for a part name, such as </w:t>
+        <w:t xml:space="preserve">As of 24 October 2026, MASTER CONFIG starts around line 764 and ends around line 1497 of DailyGrind\index.html. Use Ctrl+F to search for a part name, such as </w:t>
       </w:r>
       <w:r>
         <w:rPr>
@@ -5508,7 +5784,7 @@
     <w:p>
       <w:pPr/>
       <w:r>
-        <w:t>The three difficulty levels are set in a small table in the code, just below MASTER CONFIG (around line 1552 of index.html). They are not in MASTER CONFIG, so edit them there.</w:t>
+        <w:t>The three difficulty levels are set in a small table in the code, just below MASTER CONFIG (around line 1566 of index.html). They are not in MASTER CONFIG, so edit them there.</w:t>
       </w:r>
     </w:p>
     <w:tbl>

</xml_diff>

<commit_message>
Fix simultaneous bets, rent bill dates and nightly Life Score sampling
Snapshot bet growth before payouts, calculate rent for its bill day, and record
completed overnight effects once for both the player and rivals. Include the
final night before displaying the ending score.

Update project guidance, Config Guide, and changelog. Add targeted regression
checks and save reports/raw results for 50 simulation games. All 13 targeted
checks and both simulation batches passed their technical checks. Config Guide
layout rendering remains unavailable on this host; its package reopens.

Co-Authored-By: Codex <noreply@openai.com>
</commit_message>
<xml_diff>
--- a/docs/Daily Grind Config Guide.docx
+++ b/docs/Daily Grind Config Guide.docx
@@ -4289,6 +4289,9 @@
             <w:r>
               <w:t xml:space="preserve">The stake each side puts up, how many days the bet runs, the happiness for winning or losing, the relationship change, and each level’s chance of taking your bet.</w:t>
             </w:r>
+            <w:r>
+              <w:t xml:space="preserve"> When several bets settle on the same morning, all growth figures are calculated before any bet winnings or refunds are paid.</w:t>
+            </w:r>
           </w:p>
         </w:tc>
       </w:tr>
@@ -4381,6 +4384,9 @@
             <w:r>
               <w:t xml:space="preserve">The chance a flatmate skips their half of the rent on rent day (higher below 0); you then pay it all and lose relationship and happiness.</w:t>
             </w:r>
+            <w:r>
+              <w:t xml:space="preserve"> A skipped share applies only to that rent bill. Paying the next bill early still charges your normal half; any early payment already made is deducted when its bill is collected.</w:t>
+            </w:r>
           </w:p>
         </w:tc>
       </w:tr>
@@ -4794,6 +4800,9 @@
             <w:pPr/>
             <w:r>
               <w:t xml:space="preserve">Points for 1st, 2nd, 3rd and 4th place in each Life Score category, before the category weight.</w:t>
+            </w:r>
+            <w:r>
+              <w:t xml:space="preserve"> Nightly records use completed overnight results for you and the rivals, including health, mood, money transfers and rent processed that night. A game-ending night is recorded once before the final table; an early ending includes only effects processed before it. Past saved records are not recalculated.</w:t>
             </w:r>
           </w:p>
         </w:tc>

</xml_diff>

<commit_message>
Give rivals personalities and persistent favour memories
Add generous, ambitious, reckless and vindictive personalities with distinct
loan, repayment, betting, job-tip, job-race and tension behaviour. Remember
meaningful help, refusals and repayment history; return bounded favour credits
through later job introductions. Show personalities and memories in profiles,
encounters and Messages, and migrate existing saves without rerolling dice.

Update Rules, project documentation and the Config Guide. Add feature checks
and UI fixtures; save full UI and simulation reports with raw results.

Verified 32 targeted checks, desktop and phone UI plus reload checks, and
50 simulation games with no technical errors. Single-player gameplay results
match the preceding build across all 30 seeds. Visually inspected the 17-page
Config Guide rendered through Microsoft Word.

Co-Authored-By: Codex <noreply@openai.com>
</commit_message>
<xml_diff>
--- a/docs/Daily Grind Config Guide.docx
+++ b/docs/Daily Grind Config Guide.docx
@@ -5355,6 +5355,98 @@
             <w:pPr/>
             <w:r>
               <w:t xml:space="preserve">false turns every trait off.</w:t>
+            </w:r>
+          </w:p>
+        </w:tc>
+      </w:tr>
+      <w:tr>
+        <w:tc>
+          <w:tcPr>
+            <w:tcW w:type="dxa" w:w="2175"/>
+          </w:tcPr>
+          <w:p>
+            <w:pPr/>
+            <w:r>
+              <w:t>Change rival personalities</w:t>
+            </w:r>
+          </w:p>
+        </w:tc>
+        <w:tc>
+          <w:tcPr>
+            <w:tcW w:type="dxa" w:w="1864"/>
+          </w:tcPr>
+          <w:p>
+            <w:pPr/>
+            <w:r>
+              <w:t>rivals: personalities</w:t>
+            </w:r>
+          </w:p>
+        </w:tc>
+        <w:tc>
+          <w:tcPr>
+            <w:tcW w:type="dxa" w:w="1621"/>
+          </w:tcPr>
+          <w:p>
+            <w:pPr/>
+            <w:r>
+              <w:t>Generous, Ambitious, Reckless, Vindictive</w:t>
+            </w:r>
+          </w:p>
+        </w:tc>
+        <w:tc>
+          <w:tcPr>
+            <w:tcW w:type="dxa" w:w="3700"/>
+          </w:tcPr>
+          <w:p>
+            <w:pPr/>
+            <w:r>
+              <w:t>Each rival receives a distinct personality, separately from difficulty. name, icon, about and ask control labels and dialogue. lend, repay, bet and race add probability points; tipMult and tensionMult multiply chances. grudge multiplies negative remembered trust; returnChance is the nightly chance of returning an owed favour when eligible. All final lending and betting chances stay between 0 and 100%.</w:t>
+            </w:r>
+          </w:p>
+        </w:tc>
+      </w:tr>
+      <w:tr>
+        <w:tc>
+          <w:tcPr>
+            <w:tcW w:type="dxa" w:w="2175"/>
+          </w:tcPr>
+          <w:p>
+            <w:pPr/>
+            <w:r>
+              <w:t>Change remembered favours</w:t>
+            </w:r>
+          </w:p>
+        </w:tc>
+        <w:tc>
+          <w:tcPr>
+            <w:tcW w:type="dxa" w:w="1864"/>
+          </w:tcPr>
+          <w:p>
+            <w:pPr/>
+            <w:r>
+              <w:t>rivals: memory</w:t>
+            </w:r>
+          </w:p>
+        </w:tc>
+        <w:tc>
+          <w:tcPr>
+            <w:tcW w:type="dxa" w:w="1621"/>
+          </w:tcPr>
+          <w:p>
+            <w:pPr/>
+            <w:r>
+              <w:t>maxEntries 5, maxTrust 3, maxOwed 3, lendPerTrust 0.04</w:t>
+            </w:r>
+          </w:p>
+        </w:tc>
+        <w:tc>
+          <w:tcPr>
+            <w:tcW w:type="dxa" w:w="3700"/>
+          </w:tcPr>
+          <w:p>
+            <w:pPr/>
+            <w:r>
+              <w:t>Lending or helping on an interview-lift, birthday, shift-cover, soup or moving card earns a remembered favour. A later job introduction can return one credit while on speaking terms and without an active tip. Recent memories and trust are bounded; trust changes lending by 4 percentage points per point. lendTrust, repayTrust and helpTrust are +1; refuseTrust is -1, defaultTrust -2. Vindictive rivals double negative trust. Chats and calls earn no credits. Memories and personalities survive save/reload; existing saves gain stable personalities.</w:t>
             </w:r>
           </w:p>
         </w:tc>

</xml_diff>